<commit_message>
Exponential of Delta Exponent Energy Application | (23:53 (W.I.B [Waktu Indonesia bagian Barat]), 31/3/2026), Batam, Kepulauan Riau, Indonesia | Exponential of Delta Exponent Energy Application #EXODUS14VERSES14 #PROVERBS11VERSES24 #LUCAS8VERSES24
Exponential of Delta Exponent Energy Application | (23:53 (W.I.B [Waktu Indonesia bagian Barat]), 31/3/2026), Batam, Kepulauan Riau, Indonesia | Exponential of Delta Exponent Energy Application #EXODUS14VERSES14 #PROVERBS11VERSES24 #LUCAS8VERSES24
</commit_message>
<xml_diff>
--- a/Exponential of Delta Exponent Energy Application.docx
+++ b/Exponential of Delta Exponent Energy Application.docx
@@ -19,15 +19,7 @@
           <w:sz w:val="24"/>
           <w:szCs w:val="24"/>
         </w:rPr>
-        <w:t xml:space="preserve">Exponential of Delta Exponent </w:t>
-      </w:r>
-      <w:r>
-        <w:rPr>
-          <w:rFonts w:ascii="Times New Roman" w:eastAsiaTheme="minorEastAsia" w:hAnsi="Times New Roman" w:cs="Times New Roman"/>
-          <w:sz w:val="24"/>
-          <w:szCs w:val="24"/>
-        </w:rPr>
-        <w:t>Energ</w:t>
+        <w:t>Exponential of Delta Exponent Energ</w:t>
       </w:r>
       <w:r>
         <w:rPr>
@@ -579,25 +571,7 @@
                             <w:rPr>
                               <w:rFonts w:ascii="Cambria Math" w:hAnsi="Cambria Math"/>
                             </w:rPr>
-                            <m:t>x</m:t>
-                          </m:r>
-                          <m:r>
-                            <w:rPr>
-                              <w:rFonts w:ascii="Cambria Math" w:hAnsi="Cambria Math"/>
-                            </w:rPr>
-                            <m:t xml:space="preserve"> </m:t>
-                          </m:r>
-                          <m:r>
-                            <w:rPr>
-                              <w:rFonts w:ascii="Cambria Math" w:hAnsi="Cambria Math"/>
-                            </w:rPr>
-                            <m:t>+</m:t>
-                          </m:r>
-                          <m:r>
-                            <w:rPr>
-                              <w:rFonts w:ascii="Cambria Math" w:hAnsi="Cambria Math"/>
-                            </w:rPr>
-                            <m:t xml:space="preserve"> 1</m:t>
+                            <m:t>x + 1</m:t>
                           </m:r>
                         </m:e>
                       </m:d>
@@ -839,25 +813,7 @@
                             <w:rPr>
                               <w:rFonts w:ascii="Cambria Math" w:hAnsi="Cambria Math"/>
                             </w:rPr>
-                            <m:t>x</m:t>
-                          </m:r>
-                          <m:r>
-                            <w:rPr>
-                              <w:rFonts w:ascii="Cambria Math" w:hAnsi="Cambria Math"/>
-                            </w:rPr>
-                            <m:t xml:space="preserve"> </m:t>
-                          </m:r>
-                          <m:r>
-                            <w:rPr>
-                              <w:rFonts w:ascii="Cambria Math" w:hAnsi="Cambria Math"/>
-                            </w:rPr>
-                            <m:t>+</m:t>
-                          </m:r>
-                          <m:r>
-                            <w:rPr>
-                              <w:rFonts w:ascii="Cambria Math" w:hAnsi="Cambria Math"/>
-                            </w:rPr>
-                            <m:t xml:space="preserve"> a</m:t>
+                            <m:t>x + a</m:t>
                           </m:r>
                         </m:e>
                       </m:d>
@@ -1101,25 +1057,7 @@
                             <w:rPr>
                               <w:rFonts w:ascii="Cambria Math" w:hAnsi="Cambria Math"/>
                             </w:rPr>
-                            <m:t>x</m:t>
-                          </m:r>
-                          <m:r>
-                            <w:rPr>
-                              <w:rFonts w:ascii="Cambria Math" w:hAnsi="Cambria Math"/>
-                            </w:rPr>
-                            <m:t xml:space="preserve"> </m:t>
-                          </m:r>
-                          <m:r>
-                            <w:rPr>
-                              <w:rFonts w:ascii="Cambria Math" w:hAnsi="Cambria Math"/>
-                            </w:rPr>
-                            <m:t>+</m:t>
-                          </m:r>
-                          <m:r>
-                            <w:rPr>
-                              <w:rFonts w:ascii="Cambria Math" w:hAnsi="Cambria Math"/>
-                            </w:rPr>
-                            <m:t xml:space="preserve"> a</m:t>
+                            <m:t>x + a</m:t>
                           </m:r>
                         </m:e>
                       </m:d>
@@ -1175,20 +1113,42 @@
             </w:rPr>
             <m:t xml:space="preserve"> = </m:t>
           </m:r>
-          <m:d>
-            <m:dPr>
+          <m:nary>
+            <m:naryPr>
+              <m:chr m:val="∑"/>
+              <m:limLoc m:val="undOvr"/>
+              <m:supHide m:val="1"/>
               <m:ctrlPr>
                 <w:rPr>
                   <w:rFonts w:ascii="Cambria Math" w:hAnsi="Cambria Math"/>
                   <w:i/>
                 </w:rPr>
               </m:ctrlPr>
-            </m:dPr>
+            </m:naryPr>
+            <m:sub>
+              <m:d>
+                <m:dPr>
+                  <m:ctrlPr>
+                    <w:rPr>
+                      <w:rFonts w:ascii="Cambria Math" w:eastAsiaTheme="minorEastAsia" w:hAnsi="Cambria Math" w:cs="Times New Roman"/>
+                      <w:i/>
+                    </w:rPr>
+                  </m:ctrlPr>
+                </m:dPr>
+                <m:e>
+                  <m:r>
+                    <w:rPr>
+                      <w:rFonts w:ascii="Cambria Math" w:eastAsiaTheme="minorEastAsia" w:hAnsi="Cambria Math" w:cs="Times New Roman"/>
+                    </w:rPr>
+                    <m:t>x + a</m:t>
+                  </m:r>
+                </m:e>
+              </m:d>
+            </m:sub>
+            <m:sup/>
             <m:e>
               <m:d>
                 <m:dPr>
-                  <m:begChr m:val="{"/>
-                  <m:endChr m:val="}"/>
                   <m:ctrlPr>
                     <w:rPr>
                       <w:rFonts w:ascii="Cambria Math" w:hAnsi="Cambria Math"/>
@@ -1199,6 +1159,8 @@
                 <m:e>
                   <m:d>
                     <m:dPr>
+                      <m:begChr m:val="{"/>
+                      <m:endChr m:val="}"/>
                       <m:ctrlPr>
                         <w:rPr>
                           <w:rFonts w:ascii="Cambria Math" w:hAnsi="Cambria Math"/>
@@ -1207,11 +1169,29 @@
                       </m:ctrlPr>
                     </m:dPr>
                     <m:e>
+                      <m:d>
+                        <m:dPr>
+                          <m:ctrlPr>
+                            <w:rPr>
+                              <w:rFonts w:ascii="Cambria Math" w:hAnsi="Cambria Math"/>
+                              <w:i/>
+                            </w:rPr>
+                          </m:ctrlPr>
+                        </m:dPr>
+                        <m:e>
+                          <m:r>
+                            <w:rPr>
+                              <w:rFonts w:ascii="Cambria Math" w:hAnsi="Cambria Math"/>
+                            </w:rPr>
+                            <m:t>x + a</m:t>
+                          </m:r>
+                        </m:e>
+                      </m:d>
                       <m:r>
                         <w:rPr>
                           <w:rFonts w:ascii="Cambria Math" w:hAnsi="Cambria Math"/>
                         </w:rPr>
-                        <m:t>x + a</m:t>
+                        <m:t xml:space="preserve"> × a</m:t>
                       </m:r>
                     </m:e>
                   </m:d>
@@ -1219,18 +1199,12 @@
                     <w:rPr>
                       <w:rFonts w:ascii="Cambria Math" w:hAnsi="Cambria Math"/>
                     </w:rPr>
-                    <m:t xml:space="preserve"> × a</m:t>
+                    <m:t xml:space="preserve"> + a</m:t>
                   </m:r>
                 </m:e>
               </m:d>
-              <m:r>
-                <w:rPr>
-                  <w:rFonts w:ascii="Cambria Math" w:hAnsi="Cambria Math"/>
-                </w:rPr>
-                <m:t xml:space="preserve"> + a</m:t>
-              </m:r>
             </m:e>
-          </m:d>
+          </m:nary>
         </m:oMath>
       </m:oMathPara>
     </w:p>
@@ -1342,25 +1316,7 @@
                             <w:rPr>
                               <w:rFonts w:ascii="Cambria Math" w:hAnsi="Cambria Math"/>
                             </w:rPr>
-                            <m:t>x</m:t>
-                          </m:r>
-                          <m:r>
-                            <w:rPr>
-                              <w:rFonts w:ascii="Cambria Math" w:hAnsi="Cambria Math"/>
-                            </w:rPr>
-                            <m:t xml:space="preserve"> </m:t>
-                          </m:r>
-                          <m:r>
-                            <w:rPr>
-                              <w:rFonts w:ascii="Cambria Math" w:hAnsi="Cambria Math"/>
-                            </w:rPr>
-                            <m:t>+</m:t>
-                          </m:r>
-                          <m:r>
-                            <w:rPr>
-                              <w:rFonts w:ascii="Cambria Math" w:hAnsi="Cambria Math"/>
-                            </w:rPr>
-                            <m:t xml:space="preserve"> a</m:t>
+                            <m:t>x + a</m:t>
                           </m:r>
                         </m:e>
                       </m:d>
@@ -1416,53 +1372,24 @@
             </w:rPr>
             <m:t xml:space="preserve"> = </m:t>
           </m:r>
-          <m:d>
-            <m:dPr>
+          <m:nary>
+            <m:naryPr>
+              <m:chr m:val="∑"/>
+              <m:limLoc m:val="undOvr"/>
+              <m:supHide m:val="1"/>
               <m:ctrlPr>
                 <w:rPr>
                   <w:rFonts w:ascii="Cambria Math" w:hAnsi="Cambria Math"/>
                   <w:i/>
                 </w:rPr>
               </m:ctrlPr>
-            </m:dPr>
-            <m:e>
-              <m:sSup>
-                <m:sSupPr>
-                  <m:ctrlPr>
-                    <w:rPr>
-                      <w:rFonts w:ascii="Cambria Math" w:hAnsi="Cambria Math"/>
-                      <w:i/>
-                    </w:rPr>
-                  </m:ctrlPr>
-                </m:sSupPr>
-                <m:e>
-                  <m:r>
-                    <w:rPr>
-                      <w:rFonts w:ascii="Cambria Math" w:hAnsi="Cambria Math"/>
-                    </w:rPr>
-                    <m:t>a</m:t>
-                  </m:r>
-                </m:e>
-                <m:sup>
-                  <m:r>
-                    <w:rPr>
-                      <w:rFonts w:ascii="Cambria Math" w:hAnsi="Cambria Math"/>
-                    </w:rPr>
-                    <m:t>2</m:t>
-                  </m:r>
-                </m:sup>
-              </m:sSup>
-              <m:r>
-                <w:rPr>
-                  <w:rFonts w:ascii="Cambria Math" w:hAnsi="Cambria Math"/>
-                </w:rPr>
-                <m:t xml:space="preserve"> + </m:t>
-              </m:r>
+            </m:naryPr>
+            <m:sub>
               <m:d>
                 <m:dPr>
                   <m:ctrlPr>
                     <w:rPr>
-                      <w:rFonts w:ascii="Cambria Math" w:hAnsi="Cambria Math"/>
+                      <w:rFonts w:ascii="Cambria Math" w:eastAsiaTheme="minorEastAsia" w:hAnsi="Cambria Math" w:cs="Times New Roman"/>
                       <w:i/>
                     </w:rPr>
                   </m:ctrlPr>
@@ -1470,20 +1397,85 @@
                 <m:e>
                   <m:r>
                     <w:rPr>
-                      <w:rFonts w:ascii="Cambria Math" w:hAnsi="Cambria Math"/>
-                    </w:rPr>
-                    <m:t>x × a</m:t>
+                      <w:rFonts w:ascii="Cambria Math" w:eastAsiaTheme="minorEastAsia" w:hAnsi="Cambria Math" w:cs="Times New Roman"/>
+                    </w:rPr>
+                    <m:t>x + a</m:t>
                   </m:r>
                 </m:e>
               </m:d>
-              <m:r>
-                <w:rPr>
-                  <w:rFonts w:ascii="Cambria Math" w:hAnsi="Cambria Math"/>
-                </w:rPr>
-                <m:t xml:space="preserve"> + a</m:t>
-              </m:r>
+            </m:sub>
+            <m:sup/>
+            <m:e>
+              <m:d>
+                <m:dPr>
+                  <m:ctrlPr>
+                    <w:rPr>
+                      <w:rFonts w:ascii="Cambria Math" w:hAnsi="Cambria Math"/>
+                      <w:i/>
+                    </w:rPr>
+                  </m:ctrlPr>
+                </m:dPr>
+                <m:e>
+                  <m:sSup>
+                    <m:sSupPr>
+                      <m:ctrlPr>
+                        <w:rPr>
+                          <w:rFonts w:ascii="Cambria Math" w:hAnsi="Cambria Math"/>
+                          <w:i/>
+                        </w:rPr>
+                      </m:ctrlPr>
+                    </m:sSupPr>
+                    <m:e>
+                      <m:r>
+                        <w:rPr>
+                          <w:rFonts w:ascii="Cambria Math" w:hAnsi="Cambria Math"/>
+                        </w:rPr>
+                        <m:t>a</m:t>
+                      </m:r>
+                    </m:e>
+                    <m:sup>
+                      <m:r>
+                        <w:rPr>
+                          <w:rFonts w:ascii="Cambria Math" w:hAnsi="Cambria Math"/>
+                        </w:rPr>
+                        <m:t>2</m:t>
+                      </m:r>
+                    </m:sup>
+                  </m:sSup>
+                  <m:r>
+                    <w:rPr>
+                      <w:rFonts w:ascii="Cambria Math" w:hAnsi="Cambria Math"/>
+                    </w:rPr>
+                    <m:t xml:space="preserve"> + </m:t>
+                  </m:r>
+                  <m:d>
+                    <m:dPr>
+                      <m:ctrlPr>
+                        <w:rPr>
+                          <w:rFonts w:ascii="Cambria Math" w:hAnsi="Cambria Math"/>
+                          <w:i/>
+                        </w:rPr>
+                      </m:ctrlPr>
+                    </m:dPr>
+                    <m:e>
+                      <m:r>
+                        <w:rPr>
+                          <w:rFonts w:ascii="Cambria Math" w:hAnsi="Cambria Math"/>
+                        </w:rPr>
+                        <m:t>x × a</m:t>
+                      </m:r>
+                    </m:e>
+                  </m:d>
+                  <m:r>
+                    <w:rPr>
+                      <w:rFonts w:ascii="Cambria Math" w:hAnsi="Cambria Math"/>
+                    </w:rPr>
+                    <m:t xml:space="preserve"> + a</m:t>
+                  </m:r>
+                </m:e>
+              </m:d>
             </m:e>
-          </m:d>
+          </m:nary>
         </m:oMath>
       </m:oMathPara>
     </w:p>
@@ -1532,19 +1524,7 @@
                     <w:rPr>
                       <w:rFonts w:ascii="Cambria Math" w:eastAsiaTheme="minorEastAsia" w:hAnsi="Cambria Math" w:cs="Times New Roman"/>
                     </w:rPr>
-                    <m:t>E</m:t>
-                  </m:r>
-                  <m:r>
-                    <w:rPr>
-                      <w:rFonts w:ascii="Cambria Math" w:eastAsiaTheme="minorEastAsia" w:hAnsi="Cambria Math" w:cs="Times New Roman"/>
-                    </w:rPr>
-                    <m:t xml:space="preserve"> + </m:t>
-                  </m:r>
-                  <m:r>
-                    <w:rPr>
-                      <w:rFonts w:ascii="Cambria Math" w:eastAsiaTheme="minorEastAsia" w:hAnsi="Cambria Math" w:cs="Times New Roman"/>
-                    </w:rPr>
-                    <m:t>x</m:t>
+                    <m:t>E + x</m:t>
                   </m:r>
                 </m:e>
               </m:d>
@@ -1604,25 +1584,7 @@
                             <w:rPr>
                               <w:rFonts w:ascii="Cambria Math" w:hAnsi="Cambria Math"/>
                             </w:rPr>
-                            <m:t>E</m:t>
-                          </m:r>
-                          <m:r>
-                            <w:rPr>
-                              <w:rFonts w:ascii="Cambria Math" w:hAnsi="Cambria Math"/>
-                            </w:rPr>
-                            <m:t xml:space="preserve"> </m:t>
-                          </m:r>
-                          <m:r>
-                            <w:rPr>
-                              <w:rFonts w:ascii="Cambria Math" w:hAnsi="Cambria Math"/>
-                            </w:rPr>
-                            <m:t>+</m:t>
-                          </m:r>
-                          <m:r>
-                            <w:rPr>
-                              <w:rFonts w:ascii="Cambria Math" w:hAnsi="Cambria Math"/>
-                            </w:rPr>
-                            <m:t xml:space="preserve"> x</m:t>
+                            <m:t>E + x</m:t>
                           </m:r>
                         </m:e>
                       </m:d>
@@ -1678,53 +1640,24 @@
             </w:rPr>
             <m:t xml:space="preserve"> = </m:t>
           </m:r>
-          <m:d>
-            <m:dPr>
+          <m:nary>
+            <m:naryPr>
+              <m:chr m:val="∑"/>
+              <m:limLoc m:val="undOvr"/>
+              <m:supHide m:val="1"/>
               <m:ctrlPr>
                 <w:rPr>
                   <w:rFonts w:ascii="Cambria Math" w:hAnsi="Cambria Math"/>
                   <w:i/>
                 </w:rPr>
               </m:ctrlPr>
-            </m:dPr>
-            <m:e>
-              <m:sSup>
-                <m:sSupPr>
-                  <m:ctrlPr>
-                    <w:rPr>
-                      <w:rFonts w:ascii="Cambria Math" w:hAnsi="Cambria Math"/>
-                      <w:i/>
-                    </w:rPr>
-                  </m:ctrlPr>
-                </m:sSupPr>
-                <m:e>
-                  <m:r>
-                    <w:rPr>
-                      <w:rFonts w:ascii="Cambria Math" w:hAnsi="Cambria Math"/>
-                    </w:rPr>
-                    <m:t>x</m:t>
-                  </m:r>
-                </m:e>
-                <m:sup>
-                  <m:r>
-                    <w:rPr>
-                      <w:rFonts w:ascii="Cambria Math" w:hAnsi="Cambria Math"/>
-                    </w:rPr>
-                    <m:t>2</m:t>
-                  </m:r>
-                </m:sup>
-              </m:sSup>
-              <m:r>
-                <w:rPr>
-                  <w:rFonts w:ascii="Cambria Math" w:hAnsi="Cambria Math"/>
-                </w:rPr>
-                <m:t xml:space="preserve"> + </m:t>
-              </m:r>
+            </m:naryPr>
+            <m:sub>
               <m:d>
                 <m:dPr>
                   <m:ctrlPr>
                     <w:rPr>
-                      <w:rFonts w:ascii="Cambria Math" w:hAnsi="Cambria Math"/>
+                      <w:rFonts w:ascii="Cambria Math" w:eastAsiaTheme="minorEastAsia" w:hAnsi="Cambria Math" w:cs="Times New Roman"/>
                       <w:i/>
                     </w:rPr>
                   </m:ctrlPr>
@@ -1732,38 +1665,97 @@
                 <m:e>
                   <m:r>
                     <w:rPr>
-                      <w:rFonts w:ascii="Cambria Math" w:hAnsi="Cambria Math"/>
+                      <w:rFonts w:ascii="Cambria Math" w:eastAsiaTheme="minorEastAsia" w:hAnsi="Cambria Math" w:cs="Times New Roman"/>
                     </w:rPr>
                     <m:t>E</m:t>
                   </m:r>
                   <m:r>
                     <w:rPr>
-                      <w:rFonts w:ascii="Cambria Math" w:hAnsi="Cambria Math"/>
-                    </w:rPr>
-                    <m:t xml:space="preserve"> × </m:t>
-                  </m:r>
-                  <m:r>
-                    <w:rPr>
-                      <w:rFonts w:ascii="Cambria Math" w:hAnsi="Cambria Math"/>
+                      <w:rFonts w:ascii="Cambria Math" w:eastAsiaTheme="minorEastAsia" w:hAnsi="Cambria Math" w:cs="Times New Roman"/>
+                    </w:rPr>
+                    <m:t xml:space="preserve"> + </m:t>
+                  </m:r>
+                  <m:r>
+                    <w:rPr>
+                      <w:rFonts w:ascii="Cambria Math" w:eastAsiaTheme="minorEastAsia" w:hAnsi="Cambria Math" w:cs="Times New Roman"/>
                     </w:rPr>
                     <m:t>x</m:t>
                   </m:r>
                 </m:e>
               </m:d>
-              <m:r>
-                <w:rPr>
-                  <w:rFonts w:ascii="Cambria Math" w:hAnsi="Cambria Math"/>
-                </w:rPr>
-                <m:t xml:space="preserve"> + </m:t>
-              </m:r>
-              <m:r>
-                <w:rPr>
-                  <w:rFonts w:ascii="Cambria Math" w:hAnsi="Cambria Math"/>
-                </w:rPr>
-                <m:t>x</m:t>
-              </m:r>
+            </m:sub>
+            <m:sup/>
+            <m:e>
+              <m:d>
+                <m:dPr>
+                  <m:ctrlPr>
+                    <w:rPr>
+                      <w:rFonts w:ascii="Cambria Math" w:hAnsi="Cambria Math"/>
+                      <w:i/>
+                    </w:rPr>
+                  </m:ctrlPr>
+                </m:dPr>
+                <m:e>
+                  <m:sSup>
+                    <m:sSupPr>
+                      <m:ctrlPr>
+                        <w:rPr>
+                          <w:rFonts w:ascii="Cambria Math" w:hAnsi="Cambria Math"/>
+                          <w:i/>
+                        </w:rPr>
+                      </m:ctrlPr>
+                    </m:sSupPr>
+                    <m:e>
+                      <m:r>
+                        <w:rPr>
+                          <w:rFonts w:ascii="Cambria Math" w:hAnsi="Cambria Math"/>
+                        </w:rPr>
+                        <m:t>x</m:t>
+                      </m:r>
+                    </m:e>
+                    <m:sup>
+                      <m:r>
+                        <w:rPr>
+                          <w:rFonts w:ascii="Cambria Math" w:hAnsi="Cambria Math"/>
+                        </w:rPr>
+                        <m:t>2</m:t>
+                      </m:r>
+                    </m:sup>
+                  </m:sSup>
+                  <m:r>
+                    <w:rPr>
+                      <w:rFonts w:ascii="Cambria Math" w:hAnsi="Cambria Math"/>
+                    </w:rPr>
+                    <m:t xml:space="preserve"> + </m:t>
+                  </m:r>
+                  <m:d>
+                    <m:dPr>
+                      <m:ctrlPr>
+                        <w:rPr>
+                          <w:rFonts w:ascii="Cambria Math" w:hAnsi="Cambria Math"/>
+                          <w:i/>
+                        </w:rPr>
+                      </m:ctrlPr>
+                    </m:dPr>
+                    <m:e>
+                      <m:r>
+                        <w:rPr>
+                          <w:rFonts w:ascii="Cambria Math" w:hAnsi="Cambria Math"/>
+                        </w:rPr>
+                        <m:t>E × x</m:t>
+                      </m:r>
+                    </m:e>
+                  </m:d>
+                  <m:r>
+                    <w:rPr>
+                      <w:rFonts w:ascii="Cambria Math" w:hAnsi="Cambria Math"/>
+                    </w:rPr>
+                    <m:t xml:space="preserve"> + x</m:t>
+                  </m:r>
+                </m:e>
+              </m:d>
             </m:e>
-          </m:d>
+          </m:nary>
         </m:oMath>
       </m:oMathPara>
     </w:p>

</xml_diff>

<commit_message>
Exponential of Delta Exponent Energy Application | (00:03 (W.I.B [Waktu Indonesia bagian Barat]), 01/04/2026), Batam, Kepulauan Riau, Indonesia | Exponential of Delta Exponent Energy Application
Exponential of Delta Exponent Energy Application | (00:03 (W.I.B [Waktu Indonesia bagian Barat]), 01/04/2026), Batam, Kepulauan Riau, Indonesia | Exponential of Delta Exponent Energy Application
</commit_message>
<xml_diff>
--- a/Exponential of Delta Exponent Energy Application.docx
+++ b/Exponential of Delta Exponent Energy Application.docx
@@ -1763,7 +1763,179 @@
       <w:pPr>
         <w:spacing w:line="360" w:lineRule="auto"/>
         <w:jc w:val="center"/>
+        <w:rPr>
+          <w:rFonts w:ascii="Times New Roman" w:eastAsiaTheme="minorEastAsia" w:hAnsi="Times New Roman" w:cs="Times New Roman"/>
+          <w:sz w:val="24"/>
+          <w:szCs w:val="24"/>
+          <w:lang w:val="id-ID"/>
+        </w:rPr>
       </w:pPr>
+    </w:p>
+    <w:p>
+      <w:pPr>
+        <w:spacing w:line="360" w:lineRule="auto"/>
+        <w:jc w:val="center"/>
+      </w:pPr>
+      <m:oMathPara>
+        <m:oMath>
+          <m:d>
+            <m:dPr>
+              <m:ctrlPr>
+                <w:rPr>
+                  <w:rFonts w:ascii="Cambria Math" w:eastAsiaTheme="minorEastAsia" w:hAnsi="Cambria Math" w:cs="Times New Roman"/>
+                  <w:i/>
+                </w:rPr>
+              </m:ctrlPr>
+            </m:dPr>
+            <m:e>
+              <m:sSup>
+                <m:sSupPr>
+                  <m:ctrlPr>
+                    <w:rPr>
+                      <w:rFonts w:ascii="Cambria Math" w:hAnsi="Cambria Math"/>
+                      <w:i/>
+                    </w:rPr>
+                  </m:ctrlPr>
+                </m:sSupPr>
+                <m:e>
+                  <m:d>
+                    <m:dPr>
+                      <m:ctrlPr>
+                        <w:rPr>
+                          <w:rFonts w:ascii="Cambria Math" w:hAnsi="Cambria Math"/>
+                          <w:i/>
+                        </w:rPr>
+                      </m:ctrlPr>
+                    </m:dPr>
+                    <m:e>
+                      <m:r>
+                        <w:rPr>
+                          <w:rFonts w:ascii="Cambria Math" w:hAnsi="Cambria Math"/>
+                        </w:rPr>
+                        <m:t>E + x</m:t>
+                      </m:r>
+                    </m:e>
+                  </m:d>
+                </m:e>
+                <m:sup>
+                  <m:r>
+                    <w:rPr>
+                      <w:rFonts w:ascii="Cambria Math" w:hAnsi="Cambria Math"/>
+                    </w:rPr>
+                    <m:t>n</m:t>
+                  </m:r>
+                </m:sup>
+              </m:sSup>
+              <m:r>
+                <w:rPr>
+                  <w:rFonts w:ascii="Cambria Math" w:hAnsi="Cambria Math"/>
+                </w:rPr>
+                <m:t xml:space="preserve"> - </m:t>
+              </m:r>
+              <m:sSup>
+                <m:sSupPr>
+                  <m:ctrlPr>
+                    <w:rPr>
+                      <w:rFonts w:ascii="Cambria Math" w:eastAsiaTheme="minorEastAsia" w:hAnsi="Cambria Math" w:cs="Times New Roman"/>
+                      <w:i/>
+                    </w:rPr>
+                  </m:ctrlPr>
+                </m:sSupPr>
+                <m:e>
+                  <m:r>
+                    <w:rPr>
+                      <w:rFonts w:ascii="Cambria Math" w:eastAsiaTheme="minorEastAsia" w:hAnsi="Cambria Math" w:cs="Times New Roman"/>
+                    </w:rPr>
+                    <m:t>E</m:t>
+                  </m:r>
+                </m:e>
+                <m:sup>
+                  <m:r>
+                    <w:rPr>
+                      <w:rFonts w:ascii="Cambria Math" w:eastAsiaTheme="minorEastAsia" w:hAnsi="Cambria Math" w:cs="Times New Roman"/>
+                    </w:rPr>
+                    <m:t>n</m:t>
+                  </m:r>
+                </m:sup>
+              </m:sSup>
+            </m:e>
+          </m:d>
+          <m:r>
+            <w:rPr>
+              <w:rFonts w:ascii="Cambria Math" w:hAnsi="Cambria Math"/>
+            </w:rPr>
+            <m:t xml:space="preserve"> = </m:t>
+          </m:r>
+          <m:d>
+            <m:dPr>
+              <m:ctrlPr>
+                <w:rPr>
+                  <w:rFonts w:ascii="Cambria Math" w:hAnsi="Cambria Math"/>
+                  <w:i/>
+                </w:rPr>
+              </m:ctrlPr>
+            </m:dPr>
+            <m:e>
+              <m:sSup>
+                <m:sSupPr>
+                  <m:ctrlPr>
+                    <w:rPr>
+                      <w:rFonts w:ascii="Cambria Math" w:hAnsi="Cambria Math"/>
+                      <w:i/>
+                    </w:rPr>
+                  </m:ctrlPr>
+                </m:sSupPr>
+                <m:e>
+                  <m:r>
+                    <w:rPr>
+                      <w:rFonts w:ascii="Cambria Math" w:hAnsi="Cambria Math"/>
+                    </w:rPr>
+                    <m:t>x</m:t>
+                  </m:r>
+                </m:e>
+                <m:sup>
+                  <m:r>
+                    <w:rPr>
+                      <w:rFonts w:ascii="Cambria Math" w:hAnsi="Cambria Math"/>
+                    </w:rPr>
+                    <m:t>2</m:t>
+                  </m:r>
+                </m:sup>
+              </m:sSup>
+              <m:r>
+                <w:rPr>
+                  <w:rFonts w:ascii="Cambria Math" w:hAnsi="Cambria Math"/>
+                </w:rPr>
+                <m:t xml:space="preserve"> + </m:t>
+              </m:r>
+              <m:d>
+                <m:dPr>
+                  <m:ctrlPr>
+                    <w:rPr>
+                      <w:rFonts w:ascii="Cambria Math" w:hAnsi="Cambria Math"/>
+                      <w:i/>
+                    </w:rPr>
+                  </m:ctrlPr>
+                </m:dPr>
+                <m:e>
+                  <m:r>
+                    <w:rPr>
+                      <w:rFonts w:ascii="Cambria Math" w:hAnsi="Cambria Math"/>
+                    </w:rPr>
+                    <m:t>E × x</m:t>
+                  </m:r>
+                </m:e>
+              </m:d>
+              <m:r>
+                <w:rPr>
+                  <w:rFonts w:ascii="Cambria Math" w:hAnsi="Cambria Math"/>
+                </w:rPr>
+                <m:t xml:space="preserve"> + x</m:t>
+              </m:r>
+            </m:e>
+          </m:d>
+        </m:oMath>
+      </m:oMathPara>
     </w:p>
     <w:sectPr>
       <w:pgSz w:w="11906" w:h="16838" w:code="9"/>

</xml_diff>

<commit_message>
Exponential of Delta Exponent Energy Application | (00:59 (W.I.B [Waktu Indonesia bagian Barat]), 01/04/2026), Batam, Kepulauan Riau, Indonesia | Exponential of Delta Exponent Energy Application
Exponential of Delta Exponent Energy Application | (00:59 (W.I.B [Waktu Indonesia bagian Barat]), 01/04/2026), Batam, Kepulauan Riau, Indonesia | Exponential of Delta Exponent Energy Application
</commit_message>
<xml_diff>
--- a/Exponential of Delta Exponent Energy Application.docx
+++ b/Exponential of Delta Exponent Energy Application.docx
@@ -41,7 +41,6 @@
           <w:lang w:val="id-ID"/>
         </w:rPr>
       </w:pPr>
-      <w:proofErr w:type="spellStart"/>
       <w:r>
         <w:rPr>
           <w:rFonts w:ascii="Times New Roman" w:eastAsiaTheme="minorEastAsia" w:hAnsi="Times New Roman" w:cs="Times New Roman"/>
@@ -49,37 +48,7 @@
           <w:szCs w:val="24"/>
           <w:lang w:val="id-ID"/>
         </w:rPr>
-        <w:t>by</w:t>
-      </w:r>
-      <w:proofErr w:type="spellEnd"/>
-      <w:r>
-        <w:rPr>
-          <w:rFonts w:ascii="Times New Roman" w:eastAsiaTheme="minorEastAsia" w:hAnsi="Times New Roman" w:cs="Times New Roman"/>
-          <w:sz w:val="24"/>
-          <w:szCs w:val="24"/>
-          <w:lang w:val="id-ID"/>
-        </w:rPr>
-        <w:t xml:space="preserve"> : Samuel Hasiholan Omega Purba, S. </w:t>
-      </w:r>
-      <w:proofErr w:type="spellStart"/>
-      <w:r>
-        <w:rPr>
-          <w:rFonts w:ascii="Times New Roman" w:eastAsiaTheme="minorEastAsia" w:hAnsi="Times New Roman" w:cs="Times New Roman"/>
-          <w:sz w:val="24"/>
-          <w:szCs w:val="24"/>
-          <w:lang w:val="id-ID"/>
-        </w:rPr>
-        <w:t>Tr</w:t>
-      </w:r>
-      <w:proofErr w:type="spellEnd"/>
-      <w:r>
-        <w:rPr>
-          <w:rFonts w:ascii="Times New Roman" w:eastAsiaTheme="minorEastAsia" w:hAnsi="Times New Roman" w:cs="Times New Roman"/>
-          <w:sz w:val="24"/>
-          <w:szCs w:val="24"/>
-          <w:lang w:val="id-ID"/>
-        </w:rPr>
-        <w:t>. T.</w:t>
+        <w:t>by : Samuel Hasiholan Omega Purba, S. Tr. T.</w:t>
       </w:r>
     </w:p>
     <w:p>
@@ -114,7 +83,6 @@
           <w:lang w:val="id-ID"/>
         </w:rPr>
       </w:pPr>
-      <w:proofErr w:type="spellStart"/>
       <w:r>
         <w:rPr>
           <w:rFonts w:ascii="Times New Roman" w:eastAsiaTheme="minorEastAsia" w:hAnsi="Times New Roman" w:cs="Times New Roman"/>
@@ -122,17 +90,7 @@
           <w:szCs w:val="24"/>
           <w:lang w:val="id-ID"/>
         </w:rPr>
-        <w:t>Prodi</w:t>
-      </w:r>
-      <w:proofErr w:type="spellEnd"/>
-      <w:r>
-        <w:rPr>
-          <w:rFonts w:ascii="Times New Roman" w:eastAsiaTheme="minorEastAsia" w:hAnsi="Times New Roman" w:cs="Times New Roman"/>
-          <w:sz w:val="24"/>
-          <w:szCs w:val="24"/>
-          <w:lang w:val="id-ID"/>
-        </w:rPr>
-        <w:t xml:space="preserve"> Teknik Robotika dan Kecerdasan buatan</w:t>
+        <w:t>Prodi Teknik Robotika dan Kecerdasan buatan</w:t>
       </w:r>
     </w:p>
     <w:p>
@@ -1495,6 +1453,9 @@
       <w:pPr>
         <w:spacing w:line="360" w:lineRule="auto"/>
         <w:jc w:val="center"/>
+        <w:rPr>
+          <w:rFonts w:ascii="Times New Roman" w:eastAsiaTheme="minorEastAsia" w:hAnsi="Times New Roman" w:cs="Times New Roman"/>
+        </w:rPr>
       </w:pPr>
       <m:oMathPara>
         <m:oMath>
@@ -1922,6 +1883,12 @@
                     <w:rPr>
                       <w:rFonts w:ascii="Cambria Math" w:hAnsi="Cambria Math"/>
                     </w:rPr>
+                    <m:t xml:space="preserve">2 × </m:t>
+                  </m:r>
+                  <m:r>
+                    <w:rPr>
+                      <w:rFonts w:ascii="Cambria Math" w:hAnsi="Cambria Math"/>
+                    </w:rPr>
                     <m:t>E × x</m:t>
                   </m:r>
                 </m:e>
@@ -1930,8 +1897,40 @@
                 <w:rPr>
                   <w:rFonts w:ascii="Cambria Math" w:hAnsi="Cambria Math"/>
                 </w:rPr>
-                <m:t xml:space="preserve"> + x</m:t>
+                <m:t xml:space="preserve"> -</m:t>
               </m:r>
+              <m:r>
+                <w:rPr>
+                  <w:rFonts w:ascii="Cambria Math" w:hAnsi="Cambria Math"/>
+                </w:rPr>
+                <m:t xml:space="preserve"> </m:t>
+              </m:r>
+              <m:sSup>
+                <m:sSupPr>
+                  <m:ctrlPr>
+                    <w:rPr>
+                      <w:rFonts w:ascii="Cambria Math" w:hAnsi="Cambria Math"/>
+                      <w:i/>
+                    </w:rPr>
+                  </m:ctrlPr>
+                </m:sSupPr>
+                <m:e>
+                  <m:r>
+                    <w:rPr>
+                      <w:rFonts w:ascii="Cambria Math" w:hAnsi="Cambria Math"/>
+                    </w:rPr>
+                    <m:t>E</m:t>
+                  </m:r>
+                </m:e>
+                <m:sup>
+                  <m:r>
+                    <w:rPr>
+                      <w:rFonts w:ascii="Cambria Math" w:hAnsi="Cambria Math"/>
+                    </w:rPr>
+                    <m:t>2</m:t>
+                  </m:r>
+                </m:sup>
+              </m:sSup>
             </m:e>
           </m:d>
         </m:oMath>

</xml_diff>

<commit_message>
Exponential of Delta Exponent Energy Application | (01:02 (W.I.B [Waktu Indonesia bagian Barat]), 01/04/2026), Batam, Kepulauan Riau, Indonesia | Exponential of Delta Exponent Energy Application
Exponential of Delta Exponent Energy Application | (01:02 (W.I.B [Waktu Indonesia bagian Barat]), 01/04/2026), Batam, Kepulauan Riau, Indonesia | Exponential of Delta Exponent Energy Application
</commit_message>
<xml_diff>
--- a/Exponential of Delta Exponent Energy Application.docx
+++ b/Exponential of Delta Exponent Energy Application.docx
@@ -41,6 +41,7 @@
           <w:lang w:val="id-ID"/>
         </w:rPr>
       </w:pPr>
+      <w:proofErr w:type="spellStart"/>
       <w:r>
         <w:rPr>
           <w:rFonts w:ascii="Times New Roman" w:eastAsiaTheme="minorEastAsia" w:hAnsi="Times New Roman" w:cs="Times New Roman"/>
@@ -48,7 +49,37 @@
           <w:szCs w:val="24"/>
           <w:lang w:val="id-ID"/>
         </w:rPr>
-        <w:t>by : Samuel Hasiholan Omega Purba, S. Tr. T.</w:t>
+        <w:t>by</w:t>
+      </w:r>
+      <w:proofErr w:type="spellEnd"/>
+      <w:r>
+        <w:rPr>
+          <w:rFonts w:ascii="Times New Roman" w:eastAsiaTheme="minorEastAsia" w:hAnsi="Times New Roman" w:cs="Times New Roman"/>
+          <w:sz w:val="24"/>
+          <w:szCs w:val="24"/>
+          <w:lang w:val="id-ID"/>
+        </w:rPr>
+        <w:t xml:space="preserve"> : Samuel Hasiholan Omega Purba, S. </w:t>
+      </w:r>
+      <w:proofErr w:type="spellStart"/>
+      <w:r>
+        <w:rPr>
+          <w:rFonts w:ascii="Times New Roman" w:eastAsiaTheme="minorEastAsia" w:hAnsi="Times New Roman" w:cs="Times New Roman"/>
+          <w:sz w:val="24"/>
+          <w:szCs w:val="24"/>
+          <w:lang w:val="id-ID"/>
+        </w:rPr>
+        <w:t>Tr</w:t>
+      </w:r>
+      <w:proofErr w:type="spellEnd"/>
+      <w:r>
+        <w:rPr>
+          <w:rFonts w:ascii="Times New Roman" w:eastAsiaTheme="minorEastAsia" w:hAnsi="Times New Roman" w:cs="Times New Roman"/>
+          <w:sz w:val="24"/>
+          <w:szCs w:val="24"/>
+          <w:lang w:val="id-ID"/>
+        </w:rPr>
+        <w:t>. T.</w:t>
       </w:r>
     </w:p>
     <w:p>
@@ -83,6 +114,7 @@
           <w:lang w:val="id-ID"/>
         </w:rPr>
       </w:pPr>
+      <w:proofErr w:type="spellStart"/>
       <w:r>
         <w:rPr>
           <w:rFonts w:ascii="Times New Roman" w:eastAsiaTheme="minorEastAsia" w:hAnsi="Times New Roman" w:cs="Times New Roman"/>
@@ -90,7 +122,17 @@
           <w:szCs w:val="24"/>
           <w:lang w:val="id-ID"/>
         </w:rPr>
-        <w:t>Prodi Teknik Robotika dan Kecerdasan buatan</w:t>
+        <w:t>Prodi</w:t>
+      </w:r>
+      <w:proofErr w:type="spellEnd"/>
+      <w:r>
+        <w:rPr>
+          <w:rFonts w:ascii="Times New Roman" w:eastAsiaTheme="minorEastAsia" w:hAnsi="Times New Roman" w:cs="Times New Roman"/>
+          <w:sz w:val="24"/>
+          <w:szCs w:val="24"/>
+          <w:lang w:val="id-ID"/>
+        </w:rPr>
+        <w:t xml:space="preserve"> Teknik Robotika dan Kecerdasan buatan</w:t>
       </w:r>
     </w:p>
     <w:p>
@@ -1726,9 +1768,6 @@
         <w:jc w:val="center"/>
         <w:rPr>
           <w:rFonts w:ascii="Times New Roman" w:eastAsiaTheme="minorEastAsia" w:hAnsi="Times New Roman" w:cs="Times New Roman"/>
-          <w:sz w:val="24"/>
-          <w:szCs w:val="24"/>
-          <w:lang w:val="id-ID"/>
         </w:rPr>
       </w:pPr>
     </w:p>

</xml_diff>

<commit_message>
Exponential of Delta Exponent Energy Application | (00:05 (W.I.B [Waktu Indonesia bagian Barat]), 01/04/2026), Batam, Kepulauan Riau, Indonesia | Exponential of Delta Exponent Energy Application
Exponential of Delta Exponent Energy Application | (00:05 (W.I.B [Waktu Indonesia bagian Barat]), 01/04/2026), Batam, Kepulauan Riau, Indonesia | Exponential of Delta Exponent Energy Application
</commit_message>
<xml_diff>
--- a/Exponential of Delta Exponent Energy Application.docx
+++ b/Exponential of Delta Exponent Energy Application.docx
@@ -457,1308 +457,6 @@
               </m:r>
             </m:e>
           </m:d>
-        </m:oMath>
-      </m:oMathPara>
-    </w:p>
-    <w:p>
-      <w:pPr>
-        <w:spacing w:line="360" w:lineRule="auto"/>
-        <w:jc w:val="center"/>
-        <w:rPr>
-          <w:rFonts w:ascii="Times New Roman" w:eastAsiaTheme="minorEastAsia" w:hAnsi="Times New Roman" w:cs="Times New Roman"/>
-          <w:sz w:val="24"/>
-          <w:szCs w:val="24"/>
-          <w:lang w:val="id-ID"/>
-        </w:rPr>
-      </w:pPr>
-    </w:p>
-    <w:p>
-      <w:pPr>
-        <w:spacing w:line="360" w:lineRule="auto"/>
-        <w:jc w:val="center"/>
-        <w:rPr>
-          <w:rFonts w:eastAsiaTheme="minorEastAsia"/>
-        </w:rPr>
-      </w:pPr>
-      <m:oMathPara>
-        <m:oMathParaPr>
-          <m:jc m:val="center"/>
-        </m:oMathParaPr>
-        <m:oMath>
-          <m:nary>
-            <m:naryPr>
-              <m:chr m:val="∑"/>
-              <m:limLoc m:val="undOvr"/>
-              <m:ctrlPr>
-                <w:rPr>
-                  <w:rFonts w:ascii="Cambria Math" w:eastAsiaTheme="minorEastAsia" w:hAnsi="Cambria Math" w:cs="Times New Roman"/>
-                  <w:i/>
-                </w:rPr>
-              </m:ctrlPr>
-            </m:naryPr>
-            <m:sub>
-              <m:d>
-                <m:dPr>
-                  <m:ctrlPr>
-                    <w:rPr>
-                      <w:rFonts w:ascii="Cambria Math" w:eastAsiaTheme="minorEastAsia" w:hAnsi="Cambria Math" w:cs="Times New Roman"/>
-                      <w:i/>
-                    </w:rPr>
-                  </m:ctrlPr>
-                </m:dPr>
-                <m:e>
-                  <m:r>
-                    <w:rPr>
-                      <w:rFonts w:ascii="Cambria Math" w:eastAsiaTheme="minorEastAsia" w:hAnsi="Cambria Math" w:cs="Times New Roman"/>
-                    </w:rPr>
-                    <m:t>x + 1</m:t>
-                  </m:r>
-                </m:e>
-              </m:d>
-            </m:sub>
-            <m:sup>
-              <m:d>
-                <m:dPr>
-                  <m:ctrlPr>
-                    <w:rPr>
-                      <w:rFonts w:ascii="Cambria Math" w:eastAsiaTheme="minorEastAsia" w:hAnsi="Cambria Math" w:cs="Times New Roman"/>
-                      <w:i/>
-                    </w:rPr>
-                  </m:ctrlPr>
-                </m:dPr>
-                <m:e>
-                  <m:r>
-                    <w:rPr>
-                      <w:rFonts w:ascii="Cambria Math" w:eastAsiaTheme="minorEastAsia" w:hAnsi="Cambria Math" w:cs="Times New Roman"/>
-                    </w:rPr>
-                    <m:t>n → ∞</m:t>
-                  </m:r>
-                </m:e>
-              </m:d>
-            </m:sup>
-            <m:e>
-              <m:d>
-                <m:dPr>
-                  <m:ctrlPr>
-                    <w:rPr>
-                      <w:rFonts w:ascii="Cambria Math" w:eastAsiaTheme="minorEastAsia" w:hAnsi="Cambria Math" w:cs="Times New Roman"/>
-                      <w:i/>
-                    </w:rPr>
-                  </m:ctrlPr>
-                </m:dPr>
-                <m:e>
-                  <m:sSup>
-                    <m:sSupPr>
-                      <m:ctrlPr>
-                        <w:rPr>
-                          <w:rFonts w:ascii="Cambria Math" w:hAnsi="Cambria Math"/>
-                          <w:i/>
-                        </w:rPr>
-                      </m:ctrlPr>
-                    </m:sSupPr>
-                    <m:e>
-                      <m:d>
-                        <m:dPr>
-                          <m:ctrlPr>
-                            <w:rPr>
-                              <w:rFonts w:ascii="Cambria Math" w:hAnsi="Cambria Math"/>
-                              <w:i/>
-                            </w:rPr>
-                          </m:ctrlPr>
-                        </m:dPr>
-                        <m:e>
-                          <m:r>
-                            <w:rPr>
-                              <w:rFonts w:ascii="Cambria Math" w:hAnsi="Cambria Math"/>
-                            </w:rPr>
-                            <m:t>x + 1</m:t>
-                          </m:r>
-                        </m:e>
-                      </m:d>
-                    </m:e>
-                    <m:sup>
-                      <m:r>
-                        <w:rPr>
-                          <w:rFonts w:ascii="Cambria Math" w:hAnsi="Cambria Math"/>
-                        </w:rPr>
-                        <m:t>n</m:t>
-                      </m:r>
-                    </m:sup>
-                  </m:sSup>
-                  <m:r>
-                    <w:rPr>
-                      <w:rFonts w:ascii="Cambria Math" w:hAnsi="Cambria Math"/>
-                    </w:rPr>
-                    <m:t xml:space="preserve"> - </m:t>
-                  </m:r>
-                  <m:sSup>
-                    <m:sSupPr>
-                      <m:ctrlPr>
-                        <w:rPr>
-                          <w:rFonts w:ascii="Cambria Math" w:eastAsiaTheme="minorEastAsia" w:hAnsi="Cambria Math" w:cs="Times New Roman"/>
-                          <w:i/>
-                        </w:rPr>
-                      </m:ctrlPr>
-                    </m:sSupPr>
-                    <m:e>
-                      <m:r>
-                        <w:rPr>
-                          <w:rFonts w:ascii="Cambria Math" w:eastAsiaTheme="minorEastAsia" w:hAnsi="Cambria Math" w:cs="Times New Roman"/>
-                        </w:rPr>
-                        <m:t>x</m:t>
-                      </m:r>
-                    </m:e>
-                    <m:sup>
-                      <m:r>
-                        <w:rPr>
-                          <w:rFonts w:ascii="Cambria Math" w:eastAsiaTheme="minorEastAsia" w:hAnsi="Cambria Math" w:cs="Times New Roman"/>
-                        </w:rPr>
-                        <m:t>n</m:t>
-                      </m:r>
-                    </m:sup>
-                  </m:sSup>
-                </m:e>
-              </m:d>
-            </m:e>
-          </m:nary>
-          <m:r>
-            <w:rPr>
-              <w:rFonts w:ascii="Cambria Math" w:hAnsi="Cambria Math"/>
-            </w:rPr>
-            <m:t xml:space="preserve"> = </m:t>
-          </m:r>
-          <m:nary>
-            <m:naryPr>
-              <m:chr m:val="∑"/>
-              <m:limLoc m:val="undOvr"/>
-              <m:supHide m:val="1"/>
-              <m:ctrlPr>
-                <w:rPr>
-                  <w:rFonts w:ascii="Cambria Math" w:hAnsi="Cambria Math"/>
-                  <w:i/>
-                </w:rPr>
-              </m:ctrlPr>
-            </m:naryPr>
-            <m:sub>
-              <m:d>
-                <m:dPr>
-                  <m:ctrlPr>
-                    <w:rPr>
-                      <w:rFonts w:ascii="Cambria Math" w:hAnsi="Cambria Math"/>
-                      <w:i/>
-                    </w:rPr>
-                  </m:ctrlPr>
-                </m:dPr>
-                <m:e>
-                  <m:r>
-                    <w:rPr>
-                      <w:rFonts w:ascii="Cambria Math" w:hAnsi="Cambria Math"/>
-                    </w:rPr>
-                    <m:t>x + 1</m:t>
-                  </m:r>
-                </m:e>
-              </m:d>
-            </m:sub>
-            <m:sup/>
-            <m:e>
-              <m:d>
-                <m:dPr>
-                  <m:ctrlPr>
-                    <w:rPr>
-                      <w:rFonts w:ascii="Cambria Math" w:hAnsi="Cambria Math"/>
-                      <w:i/>
-                    </w:rPr>
-                  </m:ctrlPr>
-                </m:dPr>
-                <m:e>
-                  <m:d>
-                    <m:dPr>
-                      <m:ctrlPr>
-                        <w:rPr>
-                          <w:rFonts w:ascii="Cambria Math" w:hAnsi="Cambria Math"/>
-                          <w:i/>
-                        </w:rPr>
-                      </m:ctrlPr>
-                    </m:dPr>
-                    <m:e>
-                      <m:r>
-                        <w:rPr>
-                          <w:rFonts w:ascii="Cambria Math" w:hAnsi="Cambria Math"/>
-                        </w:rPr>
-                        <m:t>2 × x</m:t>
-                      </m:r>
-                    </m:e>
-                  </m:d>
-                  <m:r>
-                    <w:rPr>
-                      <w:rFonts w:ascii="Cambria Math" w:hAnsi="Cambria Math"/>
-                    </w:rPr>
-                    <m:t xml:space="preserve"> + 1</m:t>
-                  </m:r>
-                </m:e>
-              </m:d>
-            </m:e>
-          </m:nary>
-        </m:oMath>
-      </m:oMathPara>
-    </w:p>
-    <w:p>
-      <w:pPr>
-        <w:spacing w:line="360" w:lineRule="auto"/>
-        <w:jc w:val="center"/>
-        <w:rPr>
-          <w:rFonts w:ascii="Times New Roman" w:eastAsiaTheme="minorEastAsia" w:hAnsi="Times New Roman" w:cs="Times New Roman"/>
-          <w:sz w:val="24"/>
-          <w:szCs w:val="24"/>
-          <w:lang w:val="id-ID"/>
-        </w:rPr>
-      </w:pPr>
-    </w:p>
-    <w:p>
-      <w:pPr>
-        <w:spacing w:line="360" w:lineRule="auto"/>
-        <w:jc w:val="center"/>
-        <w:rPr>
-          <w:rFonts w:eastAsiaTheme="minorEastAsia"/>
-        </w:rPr>
-      </w:pPr>
-      <m:oMathPara>
-        <m:oMathParaPr>
-          <m:jc m:val="center"/>
-        </m:oMathParaPr>
-        <m:oMath>
-          <m:nary>
-            <m:naryPr>
-              <m:chr m:val="∑"/>
-              <m:limLoc m:val="undOvr"/>
-              <m:ctrlPr>
-                <w:rPr>
-                  <w:rFonts w:ascii="Cambria Math" w:eastAsiaTheme="minorEastAsia" w:hAnsi="Cambria Math" w:cs="Times New Roman"/>
-                  <w:i/>
-                </w:rPr>
-              </m:ctrlPr>
-            </m:naryPr>
-            <m:sub>
-              <m:d>
-                <m:dPr>
-                  <m:ctrlPr>
-                    <w:rPr>
-                      <w:rFonts w:ascii="Cambria Math" w:eastAsiaTheme="minorEastAsia" w:hAnsi="Cambria Math" w:cs="Times New Roman"/>
-                      <w:i/>
-                    </w:rPr>
-                  </m:ctrlPr>
-                </m:dPr>
-                <m:e>
-                  <m:r>
-                    <w:rPr>
-                      <w:rFonts w:ascii="Cambria Math" w:eastAsiaTheme="minorEastAsia" w:hAnsi="Cambria Math" w:cs="Times New Roman"/>
-                    </w:rPr>
-                    <m:t>x + a</m:t>
-                  </m:r>
-                </m:e>
-              </m:d>
-            </m:sub>
-            <m:sup>
-              <m:d>
-                <m:dPr>
-                  <m:ctrlPr>
-                    <w:rPr>
-                      <w:rFonts w:ascii="Cambria Math" w:eastAsiaTheme="minorEastAsia" w:hAnsi="Cambria Math" w:cs="Times New Roman"/>
-                      <w:i/>
-                    </w:rPr>
-                  </m:ctrlPr>
-                </m:dPr>
-                <m:e>
-                  <m:r>
-                    <w:rPr>
-                      <w:rFonts w:ascii="Cambria Math" w:eastAsiaTheme="minorEastAsia" w:hAnsi="Cambria Math" w:cs="Times New Roman"/>
-                    </w:rPr>
-                    <m:t>n → ∞</m:t>
-                  </m:r>
-                </m:e>
-              </m:d>
-            </m:sup>
-            <m:e>
-              <m:d>
-                <m:dPr>
-                  <m:ctrlPr>
-                    <w:rPr>
-                      <w:rFonts w:ascii="Cambria Math" w:eastAsiaTheme="minorEastAsia" w:hAnsi="Cambria Math" w:cs="Times New Roman"/>
-                      <w:i/>
-                    </w:rPr>
-                  </m:ctrlPr>
-                </m:dPr>
-                <m:e>
-                  <m:sSup>
-                    <m:sSupPr>
-                      <m:ctrlPr>
-                        <w:rPr>
-                          <w:rFonts w:ascii="Cambria Math" w:hAnsi="Cambria Math"/>
-                          <w:i/>
-                        </w:rPr>
-                      </m:ctrlPr>
-                    </m:sSupPr>
-                    <m:e>
-                      <m:d>
-                        <m:dPr>
-                          <m:ctrlPr>
-                            <w:rPr>
-                              <w:rFonts w:ascii="Cambria Math" w:hAnsi="Cambria Math"/>
-                              <w:i/>
-                            </w:rPr>
-                          </m:ctrlPr>
-                        </m:dPr>
-                        <m:e>
-                          <m:r>
-                            <w:rPr>
-                              <w:rFonts w:ascii="Cambria Math" w:hAnsi="Cambria Math"/>
-                            </w:rPr>
-                            <m:t>x + a</m:t>
-                          </m:r>
-                        </m:e>
-                      </m:d>
-                    </m:e>
-                    <m:sup>
-                      <m:r>
-                        <w:rPr>
-                          <w:rFonts w:ascii="Cambria Math" w:hAnsi="Cambria Math"/>
-                        </w:rPr>
-                        <m:t>n</m:t>
-                      </m:r>
-                    </m:sup>
-                  </m:sSup>
-                  <m:r>
-                    <w:rPr>
-                      <w:rFonts w:ascii="Cambria Math" w:hAnsi="Cambria Math"/>
-                    </w:rPr>
-                    <m:t xml:space="preserve"> - </m:t>
-                  </m:r>
-                  <m:sSup>
-                    <m:sSupPr>
-                      <m:ctrlPr>
-                        <w:rPr>
-                          <w:rFonts w:ascii="Cambria Math" w:eastAsiaTheme="minorEastAsia" w:hAnsi="Cambria Math" w:cs="Times New Roman"/>
-                          <w:i/>
-                        </w:rPr>
-                      </m:ctrlPr>
-                    </m:sSupPr>
-                    <m:e>
-                      <m:r>
-                        <w:rPr>
-                          <w:rFonts w:ascii="Cambria Math" w:eastAsiaTheme="minorEastAsia" w:hAnsi="Cambria Math" w:cs="Times New Roman"/>
-                        </w:rPr>
-                        <m:t>x</m:t>
-                      </m:r>
-                    </m:e>
-                    <m:sup>
-                      <m:r>
-                        <w:rPr>
-                          <w:rFonts w:ascii="Cambria Math" w:eastAsiaTheme="minorEastAsia" w:hAnsi="Cambria Math" w:cs="Times New Roman"/>
-                        </w:rPr>
-                        <m:t>n</m:t>
-                      </m:r>
-                    </m:sup>
-                  </m:sSup>
-                </m:e>
-              </m:d>
-            </m:e>
-          </m:nary>
-          <m:r>
-            <w:rPr>
-              <w:rFonts w:ascii="Cambria Math" w:hAnsi="Cambria Math"/>
-            </w:rPr>
-            <m:t xml:space="preserve"> = </m:t>
-          </m:r>
-          <m:nary>
-            <m:naryPr>
-              <m:chr m:val="∑"/>
-              <m:limLoc m:val="undOvr"/>
-              <m:supHide m:val="1"/>
-              <m:ctrlPr>
-                <w:rPr>
-                  <w:rFonts w:ascii="Cambria Math" w:hAnsi="Cambria Math"/>
-                  <w:i/>
-                </w:rPr>
-              </m:ctrlPr>
-            </m:naryPr>
-            <m:sub>
-              <m:d>
-                <m:dPr>
-                  <m:ctrlPr>
-                    <w:rPr>
-                      <w:rFonts w:ascii="Cambria Math" w:hAnsi="Cambria Math"/>
-                      <w:i/>
-                    </w:rPr>
-                  </m:ctrlPr>
-                </m:dPr>
-                <m:e>
-                  <m:r>
-                    <w:rPr>
-                      <w:rFonts w:ascii="Cambria Math" w:hAnsi="Cambria Math"/>
-                    </w:rPr>
-                    <m:t>x + a</m:t>
-                  </m:r>
-                </m:e>
-              </m:d>
-            </m:sub>
-            <m:sup/>
-            <m:e>
-              <m:d>
-                <m:dPr>
-                  <m:begChr m:val="{"/>
-                  <m:endChr m:val="}"/>
-                  <m:ctrlPr>
-                    <w:rPr>
-                      <w:rFonts w:ascii="Cambria Math" w:hAnsi="Cambria Math"/>
-                      <w:i/>
-                    </w:rPr>
-                  </m:ctrlPr>
-                </m:dPr>
-                <m:e>
-                  <m:d>
-                    <m:dPr>
-                      <m:ctrlPr>
-                        <w:rPr>
-                          <w:rFonts w:ascii="Cambria Math" w:hAnsi="Cambria Math"/>
-                          <w:i/>
-                        </w:rPr>
-                      </m:ctrlPr>
-                    </m:dPr>
-                    <m:e>
-                      <m:r>
-                        <w:rPr>
-                          <w:rFonts w:ascii="Cambria Math" w:hAnsi="Cambria Math"/>
-                        </w:rPr>
-                        <m:t>x × a</m:t>
-                      </m:r>
-                    </m:e>
-                  </m:d>
-                  <m:r>
-                    <w:rPr>
-                      <w:rFonts w:ascii="Cambria Math" w:hAnsi="Cambria Math"/>
-                    </w:rPr>
-                    <m:t>+ a</m:t>
-                  </m:r>
-                </m:e>
-              </m:d>
-            </m:e>
-          </m:nary>
-        </m:oMath>
-      </m:oMathPara>
-    </w:p>
-    <w:p>
-      <w:pPr>
-        <w:spacing w:line="360" w:lineRule="auto"/>
-        <w:jc w:val="center"/>
-        <w:rPr>
-          <w:rFonts w:ascii="Times New Roman" w:eastAsiaTheme="minorEastAsia" w:hAnsi="Times New Roman" w:cs="Times New Roman"/>
-          <w:sz w:val="24"/>
-          <w:szCs w:val="24"/>
-          <w:lang w:val="id-ID"/>
-        </w:rPr>
-      </w:pPr>
-    </w:p>
-    <w:p>
-      <w:pPr>
-        <w:spacing w:line="360" w:lineRule="auto"/>
-        <w:jc w:val="center"/>
-        <w:rPr>
-          <w:rFonts w:eastAsiaTheme="minorEastAsia"/>
-        </w:rPr>
-      </w:pPr>
-      <m:oMathPara>
-        <m:oMathParaPr>
-          <m:jc m:val="center"/>
-        </m:oMathParaPr>
-        <m:oMath>
-          <m:nary>
-            <m:naryPr>
-              <m:chr m:val="∑"/>
-              <m:limLoc m:val="undOvr"/>
-              <m:ctrlPr>
-                <w:rPr>
-                  <w:rFonts w:ascii="Cambria Math" w:eastAsiaTheme="minorEastAsia" w:hAnsi="Cambria Math" w:cs="Times New Roman"/>
-                  <w:i/>
-                </w:rPr>
-              </m:ctrlPr>
-            </m:naryPr>
-            <m:sub>
-              <m:d>
-                <m:dPr>
-                  <m:ctrlPr>
-                    <w:rPr>
-                      <w:rFonts w:ascii="Cambria Math" w:eastAsiaTheme="minorEastAsia" w:hAnsi="Cambria Math" w:cs="Times New Roman"/>
-                      <w:i/>
-                    </w:rPr>
-                  </m:ctrlPr>
-                </m:dPr>
-                <m:e>
-                  <m:r>
-                    <w:rPr>
-                      <w:rFonts w:ascii="Cambria Math" w:eastAsiaTheme="minorEastAsia" w:hAnsi="Cambria Math" w:cs="Times New Roman"/>
-                    </w:rPr>
-                    <m:t>x + a</m:t>
-                  </m:r>
-                </m:e>
-              </m:d>
-            </m:sub>
-            <m:sup>
-              <m:d>
-                <m:dPr>
-                  <m:ctrlPr>
-                    <w:rPr>
-                      <w:rFonts w:ascii="Cambria Math" w:eastAsiaTheme="minorEastAsia" w:hAnsi="Cambria Math" w:cs="Times New Roman"/>
-                      <w:i/>
-                    </w:rPr>
-                  </m:ctrlPr>
-                </m:dPr>
-                <m:e>
-                  <m:r>
-                    <w:rPr>
-                      <w:rFonts w:ascii="Cambria Math" w:eastAsiaTheme="minorEastAsia" w:hAnsi="Cambria Math" w:cs="Times New Roman"/>
-                    </w:rPr>
-                    <m:t>n → ∞</m:t>
-                  </m:r>
-                </m:e>
-              </m:d>
-            </m:sup>
-            <m:e>
-              <m:d>
-                <m:dPr>
-                  <m:ctrlPr>
-                    <w:rPr>
-                      <w:rFonts w:ascii="Cambria Math" w:eastAsiaTheme="minorEastAsia" w:hAnsi="Cambria Math" w:cs="Times New Roman"/>
-                      <w:i/>
-                    </w:rPr>
-                  </m:ctrlPr>
-                </m:dPr>
-                <m:e>
-                  <m:sSup>
-                    <m:sSupPr>
-                      <m:ctrlPr>
-                        <w:rPr>
-                          <w:rFonts w:ascii="Cambria Math" w:hAnsi="Cambria Math"/>
-                          <w:i/>
-                        </w:rPr>
-                      </m:ctrlPr>
-                    </m:sSupPr>
-                    <m:e>
-                      <m:d>
-                        <m:dPr>
-                          <m:ctrlPr>
-                            <w:rPr>
-                              <w:rFonts w:ascii="Cambria Math" w:hAnsi="Cambria Math"/>
-                              <w:i/>
-                            </w:rPr>
-                          </m:ctrlPr>
-                        </m:dPr>
-                        <m:e>
-                          <m:r>
-                            <w:rPr>
-                              <w:rFonts w:ascii="Cambria Math" w:hAnsi="Cambria Math"/>
-                            </w:rPr>
-                            <m:t>x + a</m:t>
-                          </m:r>
-                        </m:e>
-                      </m:d>
-                    </m:e>
-                    <m:sup>
-                      <m:r>
-                        <w:rPr>
-                          <w:rFonts w:ascii="Cambria Math" w:hAnsi="Cambria Math"/>
-                        </w:rPr>
-                        <m:t>n</m:t>
-                      </m:r>
-                    </m:sup>
-                  </m:sSup>
-                  <m:r>
-                    <w:rPr>
-                      <w:rFonts w:ascii="Cambria Math" w:hAnsi="Cambria Math"/>
-                    </w:rPr>
-                    <m:t xml:space="preserve"> - </m:t>
-                  </m:r>
-                  <m:sSup>
-                    <m:sSupPr>
-                      <m:ctrlPr>
-                        <w:rPr>
-                          <w:rFonts w:ascii="Cambria Math" w:eastAsiaTheme="minorEastAsia" w:hAnsi="Cambria Math" w:cs="Times New Roman"/>
-                          <w:i/>
-                        </w:rPr>
-                      </m:ctrlPr>
-                    </m:sSupPr>
-                    <m:e>
-                      <m:r>
-                        <w:rPr>
-                          <w:rFonts w:ascii="Cambria Math" w:eastAsiaTheme="minorEastAsia" w:hAnsi="Cambria Math" w:cs="Times New Roman"/>
-                        </w:rPr>
-                        <m:t>x</m:t>
-                      </m:r>
-                    </m:e>
-                    <m:sup>
-                      <m:r>
-                        <w:rPr>
-                          <w:rFonts w:ascii="Cambria Math" w:eastAsiaTheme="minorEastAsia" w:hAnsi="Cambria Math" w:cs="Times New Roman"/>
-                        </w:rPr>
-                        <m:t>n</m:t>
-                      </m:r>
-                    </m:sup>
-                  </m:sSup>
-                </m:e>
-              </m:d>
-            </m:e>
-          </m:nary>
-          <m:r>
-            <w:rPr>
-              <w:rFonts w:ascii="Cambria Math" w:hAnsi="Cambria Math"/>
-            </w:rPr>
-            <m:t xml:space="preserve"> = </m:t>
-          </m:r>
-          <m:nary>
-            <m:naryPr>
-              <m:chr m:val="∑"/>
-              <m:limLoc m:val="undOvr"/>
-              <m:supHide m:val="1"/>
-              <m:ctrlPr>
-                <w:rPr>
-                  <w:rFonts w:ascii="Cambria Math" w:hAnsi="Cambria Math"/>
-                  <w:i/>
-                </w:rPr>
-              </m:ctrlPr>
-            </m:naryPr>
-            <m:sub>
-              <m:d>
-                <m:dPr>
-                  <m:ctrlPr>
-                    <w:rPr>
-                      <w:rFonts w:ascii="Cambria Math" w:eastAsiaTheme="minorEastAsia" w:hAnsi="Cambria Math" w:cs="Times New Roman"/>
-                      <w:i/>
-                    </w:rPr>
-                  </m:ctrlPr>
-                </m:dPr>
-                <m:e>
-                  <m:r>
-                    <w:rPr>
-                      <w:rFonts w:ascii="Cambria Math" w:eastAsiaTheme="minorEastAsia" w:hAnsi="Cambria Math" w:cs="Times New Roman"/>
-                    </w:rPr>
-                    <m:t>x + a</m:t>
-                  </m:r>
-                </m:e>
-              </m:d>
-            </m:sub>
-            <m:sup/>
-            <m:e>
-              <m:d>
-                <m:dPr>
-                  <m:ctrlPr>
-                    <w:rPr>
-                      <w:rFonts w:ascii="Cambria Math" w:hAnsi="Cambria Math"/>
-                      <w:i/>
-                    </w:rPr>
-                  </m:ctrlPr>
-                </m:dPr>
-                <m:e>
-                  <m:d>
-                    <m:dPr>
-                      <m:begChr m:val="{"/>
-                      <m:endChr m:val="}"/>
-                      <m:ctrlPr>
-                        <w:rPr>
-                          <w:rFonts w:ascii="Cambria Math" w:hAnsi="Cambria Math"/>
-                          <w:i/>
-                        </w:rPr>
-                      </m:ctrlPr>
-                    </m:dPr>
-                    <m:e>
-                      <m:d>
-                        <m:dPr>
-                          <m:ctrlPr>
-                            <w:rPr>
-                              <w:rFonts w:ascii="Cambria Math" w:hAnsi="Cambria Math"/>
-                              <w:i/>
-                            </w:rPr>
-                          </m:ctrlPr>
-                        </m:dPr>
-                        <m:e>
-                          <m:r>
-                            <w:rPr>
-                              <w:rFonts w:ascii="Cambria Math" w:hAnsi="Cambria Math"/>
-                            </w:rPr>
-                            <m:t>x + a</m:t>
-                          </m:r>
-                        </m:e>
-                      </m:d>
-                      <m:r>
-                        <w:rPr>
-                          <w:rFonts w:ascii="Cambria Math" w:hAnsi="Cambria Math"/>
-                        </w:rPr>
-                        <m:t xml:space="preserve"> × a</m:t>
-                      </m:r>
-                    </m:e>
-                  </m:d>
-                  <m:r>
-                    <w:rPr>
-                      <w:rFonts w:ascii="Cambria Math" w:hAnsi="Cambria Math"/>
-                    </w:rPr>
-                    <m:t xml:space="preserve"> + a</m:t>
-                  </m:r>
-                </m:e>
-              </m:d>
-            </m:e>
-          </m:nary>
-        </m:oMath>
-      </m:oMathPara>
-    </w:p>
-    <w:p>
-      <w:pPr>
-        <w:spacing w:line="360" w:lineRule="auto"/>
-        <w:jc w:val="center"/>
-        <w:rPr>
-          <w:rFonts w:ascii="Times New Roman" w:eastAsiaTheme="minorEastAsia" w:hAnsi="Times New Roman" w:cs="Times New Roman"/>
-          <w:sz w:val="24"/>
-          <w:szCs w:val="24"/>
-          <w:lang w:val="id-ID"/>
-        </w:rPr>
-      </w:pPr>
-    </w:p>
-    <w:p>
-      <w:pPr>
-        <w:spacing w:line="360" w:lineRule="auto"/>
-        <w:jc w:val="center"/>
-        <w:rPr>
-          <w:rFonts w:eastAsiaTheme="minorEastAsia"/>
-        </w:rPr>
-      </w:pPr>
-      <m:oMathPara>
-        <m:oMath>
-          <m:nary>
-            <m:naryPr>
-              <m:chr m:val="∑"/>
-              <m:limLoc m:val="undOvr"/>
-              <m:ctrlPr>
-                <w:rPr>
-                  <w:rFonts w:ascii="Cambria Math" w:eastAsiaTheme="minorEastAsia" w:hAnsi="Cambria Math" w:cs="Times New Roman"/>
-                  <w:i/>
-                </w:rPr>
-              </m:ctrlPr>
-            </m:naryPr>
-            <m:sub>
-              <m:d>
-                <m:dPr>
-                  <m:ctrlPr>
-                    <w:rPr>
-                      <w:rFonts w:ascii="Cambria Math" w:eastAsiaTheme="minorEastAsia" w:hAnsi="Cambria Math" w:cs="Times New Roman"/>
-                      <w:i/>
-                    </w:rPr>
-                  </m:ctrlPr>
-                </m:dPr>
-                <m:e>
-                  <m:r>
-                    <w:rPr>
-                      <w:rFonts w:ascii="Cambria Math" w:eastAsiaTheme="minorEastAsia" w:hAnsi="Cambria Math" w:cs="Times New Roman"/>
-                    </w:rPr>
-                    <m:t>x + a</m:t>
-                  </m:r>
-                </m:e>
-              </m:d>
-            </m:sub>
-            <m:sup>
-              <m:d>
-                <m:dPr>
-                  <m:ctrlPr>
-                    <w:rPr>
-                      <w:rFonts w:ascii="Cambria Math" w:eastAsiaTheme="minorEastAsia" w:hAnsi="Cambria Math" w:cs="Times New Roman"/>
-                      <w:i/>
-                    </w:rPr>
-                  </m:ctrlPr>
-                </m:dPr>
-                <m:e>
-                  <m:r>
-                    <w:rPr>
-                      <w:rFonts w:ascii="Cambria Math" w:eastAsiaTheme="minorEastAsia" w:hAnsi="Cambria Math" w:cs="Times New Roman"/>
-                    </w:rPr>
-                    <m:t>n → ∞</m:t>
-                  </m:r>
-                </m:e>
-              </m:d>
-            </m:sup>
-            <m:e>
-              <m:d>
-                <m:dPr>
-                  <m:ctrlPr>
-                    <w:rPr>
-                      <w:rFonts w:ascii="Cambria Math" w:eastAsiaTheme="minorEastAsia" w:hAnsi="Cambria Math" w:cs="Times New Roman"/>
-                      <w:i/>
-                    </w:rPr>
-                  </m:ctrlPr>
-                </m:dPr>
-                <m:e>
-                  <m:sSup>
-                    <m:sSupPr>
-                      <m:ctrlPr>
-                        <w:rPr>
-                          <w:rFonts w:ascii="Cambria Math" w:hAnsi="Cambria Math"/>
-                          <w:i/>
-                        </w:rPr>
-                      </m:ctrlPr>
-                    </m:sSupPr>
-                    <m:e>
-                      <m:d>
-                        <m:dPr>
-                          <m:ctrlPr>
-                            <w:rPr>
-                              <w:rFonts w:ascii="Cambria Math" w:hAnsi="Cambria Math"/>
-                              <w:i/>
-                            </w:rPr>
-                          </m:ctrlPr>
-                        </m:dPr>
-                        <m:e>
-                          <m:r>
-                            <w:rPr>
-                              <w:rFonts w:ascii="Cambria Math" w:hAnsi="Cambria Math"/>
-                            </w:rPr>
-                            <m:t>x + a</m:t>
-                          </m:r>
-                        </m:e>
-                      </m:d>
-                    </m:e>
-                    <m:sup>
-                      <m:r>
-                        <w:rPr>
-                          <w:rFonts w:ascii="Cambria Math" w:hAnsi="Cambria Math"/>
-                        </w:rPr>
-                        <m:t>n</m:t>
-                      </m:r>
-                    </m:sup>
-                  </m:sSup>
-                  <m:r>
-                    <w:rPr>
-                      <w:rFonts w:ascii="Cambria Math" w:hAnsi="Cambria Math"/>
-                    </w:rPr>
-                    <m:t xml:space="preserve"> - </m:t>
-                  </m:r>
-                  <m:sSup>
-                    <m:sSupPr>
-                      <m:ctrlPr>
-                        <w:rPr>
-                          <w:rFonts w:ascii="Cambria Math" w:eastAsiaTheme="minorEastAsia" w:hAnsi="Cambria Math" w:cs="Times New Roman"/>
-                          <w:i/>
-                        </w:rPr>
-                      </m:ctrlPr>
-                    </m:sSupPr>
-                    <m:e>
-                      <m:r>
-                        <w:rPr>
-                          <w:rFonts w:ascii="Cambria Math" w:eastAsiaTheme="minorEastAsia" w:hAnsi="Cambria Math" w:cs="Times New Roman"/>
-                        </w:rPr>
-                        <m:t>x</m:t>
-                      </m:r>
-                    </m:e>
-                    <m:sup>
-                      <m:r>
-                        <w:rPr>
-                          <w:rFonts w:ascii="Cambria Math" w:eastAsiaTheme="minorEastAsia" w:hAnsi="Cambria Math" w:cs="Times New Roman"/>
-                        </w:rPr>
-                        <m:t>n</m:t>
-                      </m:r>
-                    </m:sup>
-                  </m:sSup>
-                </m:e>
-              </m:d>
-            </m:e>
-          </m:nary>
-          <m:r>
-            <w:rPr>
-              <w:rFonts w:ascii="Cambria Math" w:hAnsi="Cambria Math"/>
-            </w:rPr>
-            <m:t xml:space="preserve"> = </m:t>
-          </m:r>
-          <m:nary>
-            <m:naryPr>
-              <m:chr m:val="∑"/>
-              <m:limLoc m:val="undOvr"/>
-              <m:supHide m:val="1"/>
-              <m:ctrlPr>
-                <w:rPr>
-                  <w:rFonts w:ascii="Cambria Math" w:hAnsi="Cambria Math"/>
-                  <w:i/>
-                </w:rPr>
-              </m:ctrlPr>
-            </m:naryPr>
-            <m:sub>
-              <m:d>
-                <m:dPr>
-                  <m:ctrlPr>
-                    <w:rPr>
-                      <w:rFonts w:ascii="Cambria Math" w:eastAsiaTheme="minorEastAsia" w:hAnsi="Cambria Math" w:cs="Times New Roman"/>
-                      <w:i/>
-                    </w:rPr>
-                  </m:ctrlPr>
-                </m:dPr>
-                <m:e>
-                  <m:r>
-                    <w:rPr>
-                      <w:rFonts w:ascii="Cambria Math" w:eastAsiaTheme="minorEastAsia" w:hAnsi="Cambria Math" w:cs="Times New Roman"/>
-                    </w:rPr>
-                    <m:t>x + a</m:t>
-                  </m:r>
-                </m:e>
-              </m:d>
-            </m:sub>
-            <m:sup/>
-            <m:e>
-              <m:d>
-                <m:dPr>
-                  <m:ctrlPr>
-                    <w:rPr>
-                      <w:rFonts w:ascii="Cambria Math" w:hAnsi="Cambria Math"/>
-                      <w:i/>
-                    </w:rPr>
-                  </m:ctrlPr>
-                </m:dPr>
-                <m:e>
-                  <m:sSup>
-                    <m:sSupPr>
-                      <m:ctrlPr>
-                        <w:rPr>
-                          <w:rFonts w:ascii="Cambria Math" w:hAnsi="Cambria Math"/>
-                          <w:i/>
-                        </w:rPr>
-                      </m:ctrlPr>
-                    </m:sSupPr>
-                    <m:e>
-                      <m:r>
-                        <w:rPr>
-                          <w:rFonts w:ascii="Cambria Math" w:hAnsi="Cambria Math"/>
-                        </w:rPr>
-                        <m:t>a</m:t>
-                      </m:r>
-                    </m:e>
-                    <m:sup>
-                      <m:r>
-                        <w:rPr>
-                          <w:rFonts w:ascii="Cambria Math" w:hAnsi="Cambria Math"/>
-                        </w:rPr>
-                        <m:t>2</m:t>
-                      </m:r>
-                    </m:sup>
-                  </m:sSup>
-                  <m:r>
-                    <w:rPr>
-                      <w:rFonts w:ascii="Cambria Math" w:hAnsi="Cambria Math"/>
-                    </w:rPr>
-                    <m:t xml:space="preserve"> + </m:t>
-                  </m:r>
-                  <m:d>
-                    <m:dPr>
-                      <m:ctrlPr>
-                        <w:rPr>
-                          <w:rFonts w:ascii="Cambria Math" w:hAnsi="Cambria Math"/>
-                          <w:i/>
-                        </w:rPr>
-                      </m:ctrlPr>
-                    </m:dPr>
-                    <m:e>
-                      <m:r>
-                        <w:rPr>
-                          <w:rFonts w:ascii="Cambria Math" w:hAnsi="Cambria Math"/>
-                        </w:rPr>
-                        <m:t>x × a</m:t>
-                      </m:r>
-                    </m:e>
-                  </m:d>
-                  <m:r>
-                    <w:rPr>
-                      <w:rFonts w:ascii="Cambria Math" w:hAnsi="Cambria Math"/>
-                    </w:rPr>
-                    <m:t xml:space="preserve"> + a</m:t>
-                  </m:r>
-                </m:e>
-              </m:d>
-            </m:e>
-          </m:nary>
-        </m:oMath>
-      </m:oMathPara>
-    </w:p>
-    <w:p>
-      <w:pPr>
-        <w:spacing w:line="360" w:lineRule="auto"/>
-        <w:jc w:val="center"/>
-        <w:rPr>
-          <w:rFonts w:ascii="Times New Roman" w:eastAsiaTheme="minorEastAsia" w:hAnsi="Times New Roman" w:cs="Times New Roman"/>
-          <w:sz w:val="24"/>
-          <w:szCs w:val="24"/>
-          <w:lang w:val="id-ID"/>
-        </w:rPr>
-      </w:pPr>
-    </w:p>
-    <w:p>
-      <w:pPr>
-        <w:spacing w:line="360" w:lineRule="auto"/>
-        <w:jc w:val="center"/>
-        <w:rPr>
-          <w:rFonts w:ascii="Times New Roman" w:eastAsiaTheme="minorEastAsia" w:hAnsi="Times New Roman" w:cs="Times New Roman"/>
-        </w:rPr>
-      </w:pPr>
-      <m:oMathPara>
-        <m:oMath>
-          <m:nary>
-            <m:naryPr>
-              <m:chr m:val="∑"/>
-              <m:limLoc m:val="undOvr"/>
-              <m:ctrlPr>
-                <w:rPr>
-                  <w:rFonts w:ascii="Cambria Math" w:eastAsiaTheme="minorEastAsia" w:hAnsi="Cambria Math" w:cs="Times New Roman"/>
-                  <w:i/>
-                </w:rPr>
-              </m:ctrlPr>
-            </m:naryPr>
-            <m:sub>
-              <m:d>
-                <m:dPr>
-                  <m:ctrlPr>
-                    <w:rPr>
-                      <w:rFonts w:ascii="Cambria Math" w:eastAsiaTheme="minorEastAsia" w:hAnsi="Cambria Math" w:cs="Times New Roman"/>
-                      <w:i/>
-                    </w:rPr>
-                  </m:ctrlPr>
-                </m:dPr>
-                <m:e>
-                  <m:r>
-                    <w:rPr>
-                      <w:rFonts w:ascii="Cambria Math" w:eastAsiaTheme="minorEastAsia" w:hAnsi="Cambria Math" w:cs="Times New Roman"/>
-                    </w:rPr>
-                    <m:t>E + x</m:t>
-                  </m:r>
-                </m:e>
-              </m:d>
-            </m:sub>
-            <m:sup>
-              <m:d>
-                <m:dPr>
-                  <m:ctrlPr>
-                    <w:rPr>
-                      <w:rFonts w:ascii="Cambria Math" w:eastAsiaTheme="minorEastAsia" w:hAnsi="Cambria Math" w:cs="Times New Roman"/>
-                      <w:i/>
-                    </w:rPr>
-                  </m:ctrlPr>
-                </m:dPr>
-                <m:e>
-                  <m:r>
-                    <w:rPr>
-                      <w:rFonts w:ascii="Cambria Math" w:eastAsiaTheme="minorEastAsia" w:hAnsi="Cambria Math" w:cs="Times New Roman"/>
-                    </w:rPr>
-                    <m:t>n → ∞</m:t>
-                  </m:r>
-                </m:e>
-              </m:d>
-            </m:sup>
-            <m:e>
-              <m:d>
-                <m:dPr>
-                  <m:ctrlPr>
-                    <w:rPr>
-                      <w:rFonts w:ascii="Cambria Math" w:eastAsiaTheme="minorEastAsia" w:hAnsi="Cambria Math" w:cs="Times New Roman"/>
-                      <w:i/>
-                    </w:rPr>
-                  </m:ctrlPr>
-                </m:dPr>
-                <m:e>
-                  <m:sSup>
-                    <m:sSupPr>
-                      <m:ctrlPr>
-                        <w:rPr>
-                          <w:rFonts w:ascii="Cambria Math" w:hAnsi="Cambria Math"/>
-                          <w:i/>
-                        </w:rPr>
-                      </m:ctrlPr>
-                    </m:sSupPr>
-                    <m:e>
-                      <m:d>
-                        <m:dPr>
-                          <m:ctrlPr>
-                            <w:rPr>
-                              <w:rFonts w:ascii="Cambria Math" w:hAnsi="Cambria Math"/>
-                              <w:i/>
-                            </w:rPr>
-                          </m:ctrlPr>
-                        </m:dPr>
-                        <m:e>
-                          <m:r>
-                            <w:rPr>
-                              <w:rFonts w:ascii="Cambria Math" w:hAnsi="Cambria Math"/>
-                            </w:rPr>
-                            <m:t>E + x</m:t>
-                          </m:r>
-                        </m:e>
-                      </m:d>
-                    </m:e>
-                    <m:sup>
-                      <m:r>
-                        <w:rPr>
-                          <w:rFonts w:ascii="Cambria Math" w:hAnsi="Cambria Math"/>
-                        </w:rPr>
-                        <m:t>n</m:t>
-                      </m:r>
-                    </m:sup>
-                  </m:sSup>
-                  <m:r>
-                    <w:rPr>
-                      <w:rFonts w:ascii="Cambria Math" w:hAnsi="Cambria Math"/>
-                    </w:rPr>
-                    <m:t xml:space="preserve"> - </m:t>
-                  </m:r>
-                  <m:sSup>
-                    <m:sSupPr>
-                      <m:ctrlPr>
-                        <w:rPr>
-                          <w:rFonts w:ascii="Cambria Math" w:eastAsiaTheme="minorEastAsia" w:hAnsi="Cambria Math" w:cs="Times New Roman"/>
-                          <w:i/>
-                        </w:rPr>
-                      </m:ctrlPr>
-                    </m:sSupPr>
-                    <m:e>
-                      <m:r>
-                        <w:rPr>
-                          <w:rFonts w:ascii="Cambria Math" w:eastAsiaTheme="minorEastAsia" w:hAnsi="Cambria Math" w:cs="Times New Roman"/>
-                        </w:rPr>
-                        <m:t>E</m:t>
-                      </m:r>
-                    </m:e>
-                    <m:sup>
-                      <m:r>
-                        <w:rPr>
-                          <w:rFonts w:ascii="Cambria Math" w:eastAsiaTheme="minorEastAsia" w:hAnsi="Cambria Math" w:cs="Times New Roman"/>
-                        </w:rPr>
-                        <m:t>n</m:t>
-                      </m:r>
-                    </m:sup>
-                  </m:sSup>
-                </m:e>
-              </m:d>
-            </m:e>
-          </m:nary>
-          <m:r>
-            <w:rPr>
-              <w:rFonts w:ascii="Cambria Math" w:hAnsi="Cambria Math"/>
-            </w:rPr>
-            <m:t xml:space="preserve"> = </m:t>
-          </m:r>
-          <m:nary>
-            <m:naryPr>
-              <m:chr m:val="∑"/>
-              <m:limLoc m:val="undOvr"/>
-              <m:supHide m:val="1"/>
-              <m:ctrlPr>
-                <w:rPr>
-                  <w:rFonts w:ascii="Cambria Math" w:hAnsi="Cambria Math"/>
-                  <w:i/>
-                </w:rPr>
-              </m:ctrlPr>
-            </m:naryPr>
-            <m:sub>
-              <m:d>
-                <m:dPr>
-                  <m:ctrlPr>
-                    <w:rPr>
-                      <w:rFonts w:ascii="Cambria Math" w:eastAsiaTheme="minorEastAsia" w:hAnsi="Cambria Math" w:cs="Times New Roman"/>
-                      <w:i/>
-                    </w:rPr>
-                  </m:ctrlPr>
-                </m:dPr>
-                <m:e>
-                  <m:r>
-                    <w:rPr>
-                      <w:rFonts w:ascii="Cambria Math" w:eastAsiaTheme="minorEastAsia" w:hAnsi="Cambria Math" w:cs="Times New Roman"/>
-                    </w:rPr>
-                    <m:t>E</m:t>
-                  </m:r>
-                  <m:r>
-                    <w:rPr>
-                      <w:rFonts w:ascii="Cambria Math" w:eastAsiaTheme="minorEastAsia" w:hAnsi="Cambria Math" w:cs="Times New Roman"/>
-                    </w:rPr>
-                    <m:t xml:space="preserve"> + </m:t>
-                  </m:r>
-                  <m:r>
-                    <w:rPr>
-                      <w:rFonts w:ascii="Cambria Math" w:eastAsiaTheme="minorEastAsia" w:hAnsi="Cambria Math" w:cs="Times New Roman"/>
-                    </w:rPr>
-                    <m:t>x</m:t>
-                  </m:r>
-                </m:e>
-              </m:d>
-            </m:sub>
-            <m:sup/>
-            <m:e>
-              <m:d>
-                <m:dPr>
-                  <m:ctrlPr>
-                    <w:rPr>
-                      <w:rFonts w:ascii="Cambria Math" w:hAnsi="Cambria Math"/>
-                      <w:i/>
-                    </w:rPr>
-                  </m:ctrlPr>
-                </m:dPr>
-                <m:e>
-                  <m:sSup>
-                    <m:sSupPr>
-                      <m:ctrlPr>
-                        <w:rPr>
-                          <w:rFonts w:ascii="Cambria Math" w:hAnsi="Cambria Math"/>
-                          <w:i/>
-                        </w:rPr>
-                      </m:ctrlPr>
-                    </m:sSupPr>
-                    <m:e>
-                      <m:r>
-                        <w:rPr>
-                          <w:rFonts w:ascii="Cambria Math" w:hAnsi="Cambria Math"/>
-                        </w:rPr>
-                        <m:t>x</m:t>
-                      </m:r>
-                    </m:e>
-                    <m:sup>
-                      <m:r>
-                        <w:rPr>
-                          <w:rFonts w:ascii="Cambria Math" w:hAnsi="Cambria Math"/>
-                        </w:rPr>
-                        <m:t>2</m:t>
-                      </m:r>
-                    </m:sup>
-                  </m:sSup>
-                  <m:r>
-                    <w:rPr>
-                      <w:rFonts w:ascii="Cambria Math" w:hAnsi="Cambria Math"/>
-                    </w:rPr>
-                    <m:t xml:space="preserve"> + </m:t>
-                  </m:r>
-                  <m:d>
-                    <m:dPr>
-                      <m:ctrlPr>
-                        <w:rPr>
-                          <w:rFonts w:ascii="Cambria Math" w:hAnsi="Cambria Math"/>
-                          <w:i/>
-                        </w:rPr>
-                      </m:ctrlPr>
-                    </m:dPr>
-                    <m:e>
-                      <m:r>
-                        <w:rPr>
-                          <w:rFonts w:ascii="Cambria Math" w:hAnsi="Cambria Math"/>
-                        </w:rPr>
-                        <m:t>E × x</m:t>
-                      </m:r>
-                    </m:e>
-                  </m:d>
-                  <m:r>
-                    <w:rPr>
-                      <w:rFonts w:ascii="Cambria Math" w:hAnsi="Cambria Math"/>
-                    </w:rPr>
-                    <m:t xml:space="preserve"> + x</m:t>
-                  </m:r>
-                </m:e>
-              </m:d>
-            </m:e>
-          </m:nary>
         </m:oMath>
       </m:oMathPara>
     </w:p>

</xml_diff>

<commit_message>
Exponential of Delta Exponent Energy Application | (13:40 (W.I.B [Waktu Indonesia bagian Barat]), 02/04/2026), Batam, Kepulauan Riau, Indonesia | Exponential of Delta Exponent Energy Application
Exponential of Delta Exponent Energy Application | (13:40 (W.I.B [Waktu Indonesia bagian Barat]), 02/04/2026), Batam, Kepulauan Riau, Indonesia | Exponential of Delta Exponent Energy Application
</commit_message>
<xml_diff>
--- a/Exponential of Delta Exponent Energy Application.docx
+++ b/Exponential of Delta Exponent Energy Application.docx
@@ -596,7 +596,7 @@
                     <w:rPr>
                       <w:rFonts w:ascii="Cambria Math" w:hAnsi="Cambria Math"/>
                     </w:rPr>
-                    <m:t>2</m:t>
+                    <m:t>n</m:t>
                   </m:r>
                 </m:sup>
               </m:sSup>
@@ -620,13 +620,19 @@
                     <w:rPr>
                       <w:rFonts w:ascii="Cambria Math" w:hAnsi="Cambria Math"/>
                     </w:rPr>
-                    <m:t xml:space="preserve">2 × </m:t>
+                    <m:t>x</m:t>
                   </m:r>
                   <m:r>
                     <w:rPr>
                       <w:rFonts w:ascii="Cambria Math" w:hAnsi="Cambria Math"/>
                     </w:rPr>
-                    <m:t>E × x</m:t>
+                    <m:t xml:space="preserve"> × E × </m:t>
+                  </m:r>
+                  <m:r>
+                    <w:rPr>
+                      <w:rFonts w:ascii="Cambria Math" w:hAnsi="Cambria Math"/>
+                    </w:rPr>
+                    <m:t>n</m:t>
                   </m:r>
                 </m:e>
               </m:d>
@@ -634,13 +640,7 @@
                 <w:rPr>
                   <w:rFonts w:ascii="Cambria Math" w:hAnsi="Cambria Math"/>
                 </w:rPr>
-                <m:t xml:space="preserve"> -</m:t>
-              </m:r>
-              <m:r>
-                <w:rPr>
-                  <w:rFonts w:ascii="Cambria Math" w:hAnsi="Cambria Math"/>
-                </w:rPr>
-                <m:t xml:space="preserve"> </m:t>
+                <m:t xml:space="preserve"> - </m:t>
               </m:r>
               <m:sSup>
                 <m:sSupPr>

</xml_diff>

<commit_message>
Exponential of Delta Exponent Energy Application | (21:21 (W.I.B [Waktu Indonesia bagian Barat]), 02/04/2026), Batam, Kepulauan Riau, Indonesia | Exponential of Delta Exponent Energy Application
Exponential of Delta Exponent Energy Application | (21:21 (W.I.B [Waktu Indonesia bagian Barat]), 02/04/2026), Batam, Kepulauan Riau, Indonesia | Exponential of Delta Exponent Energy Application
</commit_message>
<xml_diff>
--- a/Exponential of Delta Exponent Energy Application.docx
+++ b/Exponential of Delta Exponent Energy Application.docx
@@ -473,6 +473,9 @@
       <w:pPr>
         <w:spacing w:line="360" w:lineRule="auto"/>
         <w:jc w:val="center"/>
+        <w:rPr>
+          <w:rFonts w:eastAsiaTheme="minorEastAsia"/>
+        </w:rPr>
       </w:pPr>
       <m:oMathPara>
         <m:oMath>
@@ -608,6 +611,8 @@
               </m:r>
               <m:d>
                 <m:dPr>
+                  <m:begChr m:val="{"/>
+                  <m:endChr m:val="}"/>
                   <m:ctrlPr>
                     <w:rPr>
                       <w:rFonts w:ascii="Cambria Math" w:hAnsi="Cambria Math"/>
@@ -620,19 +625,316 @@
                     <w:rPr>
                       <w:rFonts w:ascii="Cambria Math" w:hAnsi="Cambria Math"/>
                     </w:rPr>
+                    <m:t>x × E × n</m:t>
+                  </m:r>
+                </m:e>
+              </m:d>
+              <m:r>
+                <w:rPr>
+                  <w:rFonts w:ascii="Cambria Math" w:hAnsi="Cambria Math"/>
+                </w:rPr>
+                <m:t xml:space="preserve"> - </m:t>
+              </m:r>
+              <m:d>
+                <m:dPr>
+                  <m:begChr m:val="{"/>
+                  <m:endChr m:val="}"/>
+                  <m:ctrlPr>
+                    <w:rPr>
+                      <w:rFonts w:ascii="Cambria Math" w:hAnsi="Cambria Math"/>
+                      <w:i/>
+                    </w:rPr>
+                  </m:ctrlPr>
+                </m:dPr>
+                <m:e>
+                  <m:r>
+                    <w:rPr>
+                      <w:rFonts w:ascii="Cambria Math" w:hAnsi="Cambria Math"/>
+                    </w:rPr>
+                    <m:t xml:space="preserve">E × </m:t>
+                  </m:r>
+                  <m:d>
+                    <m:dPr>
+                      <m:ctrlPr>
+                        <w:rPr>
+                          <w:rFonts w:ascii="Cambria Math" w:hAnsi="Cambria Math"/>
+                          <w:i/>
+                        </w:rPr>
+                      </m:ctrlPr>
+                    </m:dPr>
+                    <m:e>
+                      <m:r>
+                        <w:rPr>
+                          <w:rFonts w:ascii="Cambria Math" w:hAnsi="Cambria Math"/>
+                        </w:rPr>
+                        <m:t xml:space="preserve">x - </m:t>
+                      </m:r>
+                      <m:sSup>
+                        <m:sSupPr>
+                          <m:ctrlPr>
+                            <w:rPr>
+                              <w:rFonts w:ascii="Cambria Math" w:hAnsi="Cambria Math"/>
+                              <w:i/>
+                            </w:rPr>
+                          </m:ctrlPr>
+                        </m:sSupPr>
+                        <m:e>
+                          <m:r>
+                            <w:rPr>
+                              <w:rFonts w:ascii="Cambria Math" w:hAnsi="Cambria Math"/>
+                            </w:rPr>
+                            <m:t>E</m:t>
+                          </m:r>
+                        </m:e>
+                        <m:sup>
+                          <m:d>
+                            <m:dPr>
+                              <m:ctrlPr>
+                                <w:rPr>
+                                  <w:rFonts w:ascii="Cambria Math" w:hAnsi="Cambria Math"/>
+                                  <w:i/>
+                                </w:rPr>
+                              </m:ctrlPr>
+                            </m:dPr>
+                            <m:e>
+                              <m:r>
+                                <w:rPr>
+                                  <w:rFonts w:ascii="Cambria Math" w:hAnsi="Cambria Math"/>
+                                </w:rPr>
+                                <m:t>n</m:t>
+                              </m:r>
+                              <m:r>
+                                <w:rPr>
+                                  <w:rFonts w:ascii="Cambria Math" w:hAnsi="Cambria Math"/>
+                                </w:rPr>
+                                <m:t xml:space="preserve"> </m:t>
+                              </m:r>
+                              <m:r>
+                                <w:rPr>
+                                  <w:rFonts w:ascii="Cambria Math" w:hAnsi="Cambria Math"/>
+                                </w:rPr>
+                                <m:t>-</m:t>
+                              </m:r>
+                              <m:r>
+                                <w:rPr>
+                                  <w:rFonts w:ascii="Cambria Math" w:hAnsi="Cambria Math"/>
+                                </w:rPr>
+                                <m:t xml:space="preserve"> </m:t>
+                              </m:r>
+                              <m:r>
+                                <w:rPr>
+                                  <w:rFonts w:ascii="Cambria Math" w:hAnsi="Cambria Math"/>
+                                </w:rPr>
+                                <m:t>1</m:t>
+                              </m:r>
+                            </m:e>
+                          </m:d>
+                        </m:sup>
+                      </m:sSup>
+                    </m:e>
+                  </m:d>
+                </m:e>
+              </m:d>
+            </m:e>
+          </m:d>
+        </m:oMath>
+      </m:oMathPara>
+    </w:p>
+    <w:p>
+      <w:pPr>
+        <w:spacing w:line="360" w:lineRule="auto"/>
+        <w:jc w:val="center"/>
+        <w:rPr>
+          <w:rFonts w:ascii="Times New Roman" w:eastAsiaTheme="minorEastAsia" w:hAnsi="Times New Roman" w:cs="Times New Roman"/>
+        </w:rPr>
+      </w:pPr>
+    </w:p>
+    <w:p>
+      <w:pPr>
+        <w:spacing w:line="360" w:lineRule="auto"/>
+        <w:jc w:val="center"/>
+      </w:pPr>
+      <m:oMathPara>
+        <m:oMath>
+          <m:d>
+            <m:dPr>
+              <m:ctrlPr>
+                <w:rPr>
+                  <w:rFonts w:ascii="Cambria Math" w:eastAsiaTheme="minorEastAsia" w:hAnsi="Cambria Math" w:cs="Times New Roman"/>
+                  <w:i/>
+                </w:rPr>
+              </m:ctrlPr>
+            </m:dPr>
+            <m:e>
+              <m:sSup>
+                <m:sSupPr>
+                  <m:ctrlPr>
+                    <w:rPr>
+                      <w:rFonts w:ascii="Cambria Math" w:hAnsi="Cambria Math"/>
+                      <w:i/>
+                    </w:rPr>
+                  </m:ctrlPr>
+                </m:sSupPr>
+                <m:e>
+                  <m:d>
+                    <m:dPr>
+                      <m:ctrlPr>
+                        <w:rPr>
+                          <w:rFonts w:ascii="Cambria Math" w:hAnsi="Cambria Math"/>
+                          <w:i/>
+                        </w:rPr>
+                      </m:ctrlPr>
+                    </m:dPr>
+                    <m:e>
+                      <m:r>
+                        <w:rPr>
+                          <w:rFonts w:ascii="Cambria Math" w:hAnsi="Cambria Math"/>
+                        </w:rPr>
+                        <m:t>E + x</m:t>
+                      </m:r>
+                    </m:e>
+                  </m:d>
+                </m:e>
+                <m:sup>
+                  <m:r>
+                    <w:rPr>
+                      <w:rFonts w:ascii="Cambria Math" w:hAnsi="Cambria Math"/>
+                    </w:rPr>
+                    <m:t>n</m:t>
+                  </m:r>
+                </m:sup>
+              </m:sSup>
+              <m:r>
+                <w:rPr>
+                  <w:rFonts w:ascii="Cambria Math" w:hAnsi="Cambria Math"/>
+                </w:rPr>
+                <m:t xml:space="preserve"> - </m:t>
+              </m:r>
+              <m:sSup>
+                <m:sSupPr>
+                  <m:ctrlPr>
+                    <w:rPr>
+                      <w:rFonts w:ascii="Cambria Math" w:eastAsiaTheme="minorEastAsia" w:hAnsi="Cambria Math" w:cs="Times New Roman"/>
+                      <w:i/>
+                    </w:rPr>
+                  </m:ctrlPr>
+                </m:sSupPr>
+                <m:e>
+                  <m:r>
+                    <w:rPr>
+                      <w:rFonts w:ascii="Cambria Math" w:eastAsiaTheme="minorEastAsia" w:hAnsi="Cambria Math" w:cs="Times New Roman"/>
+                    </w:rPr>
+                    <m:t>E</m:t>
+                  </m:r>
+                </m:e>
+                <m:sup>
+                  <m:r>
+                    <w:rPr>
+                      <w:rFonts w:ascii="Cambria Math" w:eastAsiaTheme="minorEastAsia" w:hAnsi="Cambria Math" w:cs="Times New Roman"/>
+                    </w:rPr>
+                    <m:t>n</m:t>
+                  </m:r>
+                </m:sup>
+              </m:sSup>
+            </m:e>
+          </m:d>
+          <m:r>
+            <w:rPr>
+              <w:rFonts w:ascii="Cambria Math" w:hAnsi="Cambria Math"/>
+            </w:rPr>
+            <m:t xml:space="preserve"> = </m:t>
+          </m:r>
+          <m:d>
+            <m:dPr>
+              <m:ctrlPr>
+                <w:rPr>
+                  <w:rFonts w:ascii="Cambria Math" w:hAnsi="Cambria Math"/>
+                  <w:i/>
+                </w:rPr>
+              </m:ctrlPr>
+            </m:dPr>
+            <m:e>
+              <m:sSup>
+                <m:sSupPr>
+                  <m:ctrlPr>
+                    <w:rPr>
+                      <w:rFonts w:ascii="Cambria Math" w:hAnsi="Cambria Math"/>
+                      <w:i/>
+                    </w:rPr>
+                  </m:ctrlPr>
+                </m:sSupPr>
+                <m:e>
+                  <m:r>
+                    <w:rPr>
+                      <w:rFonts w:ascii="Cambria Math" w:hAnsi="Cambria Math"/>
+                    </w:rPr>
                     <m:t>x</m:t>
                   </m:r>
+                </m:e>
+                <m:sup>
                   <m:r>
                     <w:rPr>
                       <w:rFonts w:ascii="Cambria Math" w:hAnsi="Cambria Math"/>
                     </w:rPr>
-                    <m:t xml:space="preserve"> × E × </m:t>
+                    <m:t>n</m:t>
+                  </m:r>
+                </m:sup>
+              </m:sSup>
+              <m:r>
+                <w:rPr>
+                  <w:rFonts w:ascii="Cambria Math" w:hAnsi="Cambria Math"/>
+                </w:rPr>
+                <m:t xml:space="preserve"> + </m:t>
+              </m:r>
+              <m:d>
+                <m:dPr>
+                  <m:begChr m:val="{"/>
+                  <m:endChr m:val="}"/>
+                  <m:ctrlPr>
+                    <w:rPr>
+                      <w:rFonts w:ascii="Cambria Math" w:hAnsi="Cambria Math"/>
+                      <w:i/>
+                    </w:rPr>
+                  </m:ctrlPr>
+                </m:dPr>
+                <m:e>
+                  <m:r>
+                    <w:rPr>
+                      <w:rFonts w:ascii="Cambria Math" w:hAnsi="Cambria Math"/>
+                    </w:rPr>
+                    <m:t>x × E × n</m:t>
+                  </m:r>
+                </m:e>
+              </m:d>
+              <m:r>
+                <w:rPr>
+                  <w:rFonts w:ascii="Cambria Math" w:hAnsi="Cambria Math"/>
+                </w:rPr>
+                <m:t xml:space="preserve"> - </m:t>
+              </m:r>
+              <m:d>
+                <m:dPr>
+                  <m:begChr m:val="{"/>
+                  <m:endChr m:val="}"/>
+                  <m:ctrlPr>
+                    <w:rPr>
+                      <w:rFonts w:ascii="Cambria Math" w:hAnsi="Cambria Math"/>
+                      <w:i/>
+                    </w:rPr>
+                  </m:ctrlPr>
+                </m:dPr>
+                <m:e>
+                  <m:r>
+                    <w:rPr>
+                      <w:rFonts w:ascii="Cambria Math" w:hAnsi="Cambria Math"/>
+                    </w:rPr>
+                    <m:t xml:space="preserve">E × </m:t>
                   </m:r>
                   <m:r>
                     <w:rPr>
                       <w:rFonts w:ascii="Cambria Math" w:hAnsi="Cambria Math"/>
                     </w:rPr>
-                    <m:t>n</m:t>
+                    <m:t>x</m:t>
                   </m:r>
                 </m:e>
               </m:d>
@@ -660,12 +962,48 @@
                   </m:r>
                 </m:e>
                 <m:sup>
-                  <m:r>
-                    <w:rPr>
-                      <w:rFonts w:ascii="Cambria Math" w:hAnsi="Cambria Math"/>
-                    </w:rPr>
-                    <m:t>2</m:t>
-                  </m:r>
+                  <m:d>
+                    <m:dPr>
+                      <m:ctrlPr>
+                        <w:rPr>
+                          <w:rFonts w:ascii="Cambria Math" w:hAnsi="Cambria Math"/>
+                          <w:i/>
+                        </w:rPr>
+                      </m:ctrlPr>
+                    </m:dPr>
+                    <m:e>
+                      <m:d>
+                        <m:dPr>
+                          <m:ctrlPr>
+                            <w:rPr>
+                              <w:rFonts w:ascii="Cambria Math" w:hAnsi="Cambria Math"/>
+                              <w:i/>
+                            </w:rPr>
+                          </m:ctrlPr>
+                        </m:dPr>
+                        <m:e>
+                          <m:r>
+                            <w:rPr>
+                              <w:rFonts w:ascii="Cambria Math" w:hAnsi="Cambria Math"/>
+                            </w:rPr>
+                            <m:t xml:space="preserve">2 × </m:t>
+                          </m:r>
+                          <m:r>
+                            <w:rPr>
+                              <w:rFonts w:ascii="Cambria Math" w:hAnsi="Cambria Math"/>
+                            </w:rPr>
+                            <m:t>n</m:t>
+                          </m:r>
+                        </m:e>
+                      </m:d>
+                      <m:r>
+                        <w:rPr>
+                          <w:rFonts w:ascii="Cambria Math" w:hAnsi="Cambria Math"/>
+                        </w:rPr>
+                        <m:t xml:space="preserve"> - 1</m:t>
+                      </m:r>
+                    </m:e>
+                  </m:d>
                 </m:sup>
               </m:sSup>
             </m:e>

</xml_diff>

<commit_message>
Exponential of Delta Exponent Energy Application | (21:40 (W.I.B [Waktu Indonesia bagian Barat]), 02/04/2026), Batam, Kepulauan Riau, Indonesia | Exponential of Delta Exponent Energy Application
Exponential of Delta Exponent Energy Application | (21:40 (W.I.B [Waktu Indonesia bagian Barat]), 02/04/2026), Batam, Kepulauan Riau, Indonesia | Exponential of Delta Exponent Energy Application
</commit_message>
<xml_diff>
--- a/Exponential of Delta Exponent Energy Application.docx
+++ b/Exponential of Delta Exponent Energy Application.docx
@@ -635,24 +635,62 @@
                 </w:rPr>
                 <m:t xml:space="preserve"> - </m:t>
               </m:r>
-              <m:d>
-                <m:dPr>
-                  <m:begChr m:val="{"/>
-                  <m:endChr m:val="}"/>
+              <m:sSup>
+                <m:sSupPr>
                   <m:ctrlPr>
                     <w:rPr>
                       <w:rFonts w:ascii="Cambria Math" w:hAnsi="Cambria Math"/>
                       <w:i/>
                     </w:rPr>
                   </m:ctrlPr>
-                </m:dPr>
+                </m:sSupPr>
                 <m:e>
-                  <m:r>
-                    <w:rPr>
-                      <w:rFonts w:ascii="Cambria Math" w:hAnsi="Cambria Math"/>
-                    </w:rPr>
-                    <m:t xml:space="preserve">E × </m:t>
-                  </m:r>
+                  <m:d>
+                    <m:dPr>
+                      <m:begChr m:val="{"/>
+                      <m:endChr m:val="}"/>
+                      <m:ctrlPr>
+                        <w:rPr>
+                          <w:rFonts w:ascii="Cambria Math" w:hAnsi="Cambria Math"/>
+                          <w:i/>
+                        </w:rPr>
+                      </m:ctrlPr>
+                    </m:dPr>
+                    <m:e>
+                      <m:r>
+                        <w:rPr>
+                          <w:rFonts w:ascii="Cambria Math" w:hAnsi="Cambria Math"/>
+                        </w:rPr>
+                        <m:t xml:space="preserve">E × </m:t>
+                      </m:r>
+                      <m:d>
+                        <m:dPr>
+                          <m:ctrlPr>
+                            <w:rPr>
+                              <w:rFonts w:ascii="Cambria Math" w:hAnsi="Cambria Math"/>
+                              <w:i/>
+                            </w:rPr>
+                          </m:ctrlPr>
+                        </m:dPr>
+                        <m:e>
+                          <m:r>
+                            <w:rPr>
+                              <w:rFonts w:ascii="Cambria Math" w:hAnsi="Cambria Math"/>
+                            </w:rPr>
+                            <m:t xml:space="preserve">x - </m:t>
+                          </m:r>
+                          <m:r>
+                            <w:rPr>
+                              <w:rFonts w:ascii="Cambria Math" w:hAnsi="Cambria Math"/>
+                            </w:rPr>
+                            <m:t>E</m:t>
+                          </m:r>
+                        </m:e>
+                      </m:d>
+                    </m:e>
+                  </m:d>
+                </m:e>
+                <m:sup>
                   <m:d>
                     <m:dPr>
                       <m:ctrlPr>
@@ -667,74 +705,12 @@
                         <w:rPr>
                           <w:rFonts w:ascii="Cambria Math" w:hAnsi="Cambria Math"/>
                         </w:rPr>
-                        <m:t xml:space="preserve">x - </m:t>
+                        <m:t>n - 1</m:t>
                       </m:r>
-                      <m:sSup>
-                        <m:sSupPr>
-                          <m:ctrlPr>
-                            <w:rPr>
-                              <w:rFonts w:ascii="Cambria Math" w:hAnsi="Cambria Math"/>
-                              <w:i/>
-                            </w:rPr>
-                          </m:ctrlPr>
-                        </m:sSupPr>
-                        <m:e>
-                          <m:r>
-                            <w:rPr>
-                              <w:rFonts w:ascii="Cambria Math" w:hAnsi="Cambria Math"/>
-                            </w:rPr>
-                            <m:t>E</m:t>
-                          </m:r>
-                        </m:e>
-                        <m:sup>
-                          <m:d>
-                            <m:dPr>
-                              <m:ctrlPr>
-                                <w:rPr>
-                                  <w:rFonts w:ascii="Cambria Math" w:hAnsi="Cambria Math"/>
-                                  <w:i/>
-                                </w:rPr>
-                              </m:ctrlPr>
-                            </m:dPr>
-                            <m:e>
-                              <m:r>
-                                <w:rPr>
-                                  <w:rFonts w:ascii="Cambria Math" w:hAnsi="Cambria Math"/>
-                                </w:rPr>
-                                <m:t>n</m:t>
-                              </m:r>
-                              <m:r>
-                                <w:rPr>
-                                  <w:rFonts w:ascii="Cambria Math" w:hAnsi="Cambria Math"/>
-                                </w:rPr>
-                                <m:t xml:space="preserve"> </m:t>
-                              </m:r>
-                              <m:r>
-                                <w:rPr>
-                                  <w:rFonts w:ascii="Cambria Math" w:hAnsi="Cambria Math"/>
-                                </w:rPr>
-                                <m:t>-</m:t>
-                              </m:r>
-                              <m:r>
-                                <w:rPr>
-                                  <w:rFonts w:ascii="Cambria Math" w:hAnsi="Cambria Math"/>
-                                </w:rPr>
-                                <m:t xml:space="preserve"> </m:t>
-                              </m:r>
-                              <m:r>
-                                <w:rPr>
-                                  <w:rFonts w:ascii="Cambria Math" w:hAnsi="Cambria Math"/>
-                                </w:rPr>
-                                <m:t>1</m:t>
-                              </m:r>
-                            </m:e>
-                          </m:d>
-                        </m:sup>
-                      </m:sSup>
                     </m:e>
                   </m:d>
-                </m:e>
-              </m:d>
+                </m:sup>
+              </m:sSup>
             </m:e>
           </m:d>
         </m:oMath>
@@ -912,32 +888,64 @@
                 </w:rPr>
                 <m:t xml:space="preserve"> - </m:t>
               </m:r>
-              <m:d>
-                <m:dPr>
-                  <m:begChr m:val="{"/>
-                  <m:endChr m:val="}"/>
+              <m:sSup>
+                <m:sSupPr>
                   <m:ctrlPr>
                     <w:rPr>
                       <w:rFonts w:ascii="Cambria Math" w:hAnsi="Cambria Math"/>
                       <w:i/>
                     </w:rPr>
                   </m:ctrlPr>
-                </m:dPr>
+                </m:sSupPr>
                 <m:e>
-                  <m:r>
-                    <w:rPr>
-                      <w:rFonts w:ascii="Cambria Math" w:hAnsi="Cambria Math"/>
-                    </w:rPr>
-                    <m:t xml:space="preserve">E × </m:t>
-                  </m:r>
-                  <m:r>
-                    <w:rPr>
-                      <w:rFonts w:ascii="Cambria Math" w:hAnsi="Cambria Math"/>
-                    </w:rPr>
-                    <m:t>x</m:t>
-                  </m:r>
+                  <m:d>
+                    <m:dPr>
+                      <m:begChr m:val="{"/>
+                      <m:endChr m:val="}"/>
+                      <m:ctrlPr>
+                        <w:rPr>
+                          <w:rFonts w:ascii="Cambria Math" w:hAnsi="Cambria Math"/>
+                          <w:i/>
+                        </w:rPr>
+                      </m:ctrlPr>
+                    </m:dPr>
+                    <m:e>
+                      <m:r>
+                        <w:rPr>
+                          <w:rFonts w:ascii="Cambria Math" w:hAnsi="Cambria Math"/>
+                        </w:rPr>
+                        <m:t xml:space="preserve">E × </m:t>
+                      </m:r>
+                      <m:r>
+                        <w:rPr>
+                          <w:rFonts w:ascii="Cambria Math" w:hAnsi="Cambria Math"/>
+                        </w:rPr>
+                        <m:t>x</m:t>
+                      </m:r>
+                    </m:e>
+                  </m:d>
                 </m:e>
-              </m:d>
+                <m:sup>
+                  <m:d>
+                    <m:dPr>
+                      <m:ctrlPr>
+                        <w:rPr>
+                          <w:rFonts w:ascii="Cambria Math" w:hAnsi="Cambria Math"/>
+                          <w:i/>
+                        </w:rPr>
+                      </m:ctrlPr>
+                    </m:dPr>
+                    <m:e>
+                      <m:r>
+                        <w:rPr>
+                          <w:rFonts w:ascii="Cambria Math" w:hAnsi="Cambria Math"/>
+                        </w:rPr>
+                        <m:t>n - 1</m:t>
+                      </m:r>
+                    </m:e>
+                  </m:d>
+                </m:sup>
+              </m:sSup>
               <m:r>
                 <w:rPr>
                   <w:rFonts w:ascii="Cambria Math" w:hAnsi="Cambria Math"/>

</xml_diff>

<commit_message>
Exponential of Delta Exponent Energy Application | (16:01 (W.I.B [Waktu Indonesia bagian Barat]), 03/04/2026), Batam, Kepulauan Riau, Indonesia | Exponential of Delta Exponent Energy Application
Exponential of Delta Exponent Energy Application | (16:01 (W.I.B [Waktu Indonesia bagian Barat]), 03/04/2026), Batam, Kepulauan Riau, Indonesia | Exponential of Delta Exponent Energy Application
</commit_message>
<xml_diff>
--- a/Exponential of Delta Exponent Energy Application.docx
+++ b/Exponential of Delta Exponent Energy Application.docx
@@ -677,13 +677,7 @@
                             <w:rPr>
                               <w:rFonts w:ascii="Cambria Math" w:hAnsi="Cambria Math"/>
                             </w:rPr>
-                            <m:t xml:space="preserve">x - </m:t>
-                          </m:r>
-                          <m:r>
-                            <w:rPr>
-                              <w:rFonts w:ascii="Cambria Math" w:hAnsi="Cambria Math"/>
-                            </w:rPr>
-                            <m:t>E</m:t>
+                            <m:t>x - E</m:t>
                           </m:r>
                         </m:e>
                       </m:d>
@@ -914,13 +908,7 @@
                         <w:rPr>
                           <w:rFonts w:ascii="Cambria Math" w:hAnsi="Cambria Math"/>
                         </w:rPr>
-                        <m:t xml:space="preserve">E × </m:t>
-                      </m:r>
-                      <m:r>
-                        <w:rPr>
-                          <w:rFonts w:ascii="Cambria Math" w:hAnsi="Cambria Math"/>
-                        </w:rPr>
-                        <m:t>x</m:t>
+                        <m:t>E × x</m:t>
                       </m:r>
                     </m:e>
                   </m:d>
@@ -950,7 +938,7 @@
                 <w:rPr>
                   <w:rFonts w:ascii="Cambria Math" w:hAnsi="Cambria Math"/>
                 </w:rPr>
-                <m:t xml:space="preserve"> - </m:t>
+                <m:t xml:space="preserve"> + </m:t>
               </m:r>
               <m:sSup>
                 <m:sSupPr>
@@ -994,13 +982,7 @@
                             <w:rPr>
                               <w:rFonts w:ascii="Cambria Math" w:hAnsi="Cambria Math"/>
                             </w:rPr>
-                            <m:t xml:space="preserve">2 × </m:t>
-                          </m:r>
-                          <m:r>
-                            <w:rPr>
-                              <w:rFonts w:ascii="Cambria Math" w:hAnsi="Cambria Math"/>
-                            </w:rPr>
-                            <m:t>n</m:t>
+                            <m:t>2 × n</m:t>
                           </m:r>
                         </m:e>
                       </m:d>

</xml_diff>

<commit_message>
Exponential of Delta Exponent Energy Application | (07:30 (W.I.B [Waktu Indonesia bagian Barat]), 04/04/2026), Batam, Kepulauan Riau, Indonesia | Exponential of Delta Exponent Energy Application
Exponential of Delta Exponent Energy Application | (07:30 (W.I.B [Waktu Indonesia bagian Barat]), 04/04/2026), Batam, Kepulauan Riau, Indonesia | Exponential of Delta Exponent Energy Application
</commit_message>
<xml_diff>
--- a/Exponential of Delta Exponent Energy Application.docx
+++ b/Exponential of Delta Exponent Energy Application.docx
@@ -176,137 +176,138 @@
           <w:rFonts w:eastAsiaTheme="minorEastAsia"/>
         </w:rPr>
       </w:pPr>
-      <m:oMathPara>
-        <m:oMathParaPr>
-          <m:jc m:val="center"/>
-        </m:oMathParaPr>
-        <m:oMath>
-          <m:d>
-            <m:dPr>
-              <m:ctrlPr>
-                <w:rPr>
-                  <w:rFonts w:ascii="Cambria Math" w:eastAsiaTheme="minorEastAsia" w:hAnsi="Cambria Math" w:cs="Times New Roman"/>
-                  <w:i/>
-                </w:rPr>
-              </m:ctrlPr>
-            </m:dPr>
-            <m:e>
-              <m:sSup>
-                <m:sSupPr>
-                  <m:ctrlPr>
-                    <w:rPr>
-                      <w:rFonts w:ascii="Cambria Math" w:hAnsi="Cambria Math"/>
-                      <w:i/>
-                    </w:rPr>
-                  </m:ctrlPr>
-                </m:sSupPr>
-                <m:e>
-                  <m:d>
-                    <m:dPr>
-                      <m:ctrlPr>
-                        <w:rPr>
-                          <w:rFonts w:ascii="Cambria Math" w:hAnsi="Cambria Math"/>
-                          <w:i/>
-                        </w:rPr>
-                      </m:ctrlPr>
-                    </m:dPr>
-                    <m:e>
-                      <m:r>
-                        <w:rPr>
-                          <w:rFonts w:ascii="Cambria Math" w:hAnsi="Cambria Math"/>
-                        </w:rPr>
-                        <m:t>x+1</m:t>
-                      </m:r>
-                    </m:e>
-                  </m:d>
-                </m:e>
-                <m:sup>
-                  <m:r>
-                    <w:rPr>
-                      <w:rFonts w:ascii="Cambria Math" w:hAnsi="Cambria Math"/>
-                    </w:rPr>
-                    <m:t>n</m:t>
-                  </m:r>
-                </m:sup>
-              </m:sSup>
-              <m:r>
-                <w:rPr>
-                  <w:rFonts w:ascii="Cambria Math" w:hAnsi="Cambria Math"/>
-                </w:rPr>
-                <m:t xml:space="preserve"> - </m:t>
-              </m:r>
-              <m:sSup>
-                <m:sSupPr>
-                  <m:ctrlPr>
-                    <w:rPr>
-                      <w:rFonts w:ascii="Cambria Math" w:eastAsiaTheme="minorEastAsia" w:hAnsi="Cambria Math" w:cs="Times New Roman"/>
-                      <w:i/>
-                    </w:rPr>
-                  </m:ctrlPr>
-                </m:sSupPr>
-                <m:e>
-                  <m:r>
-                    <w:rPr>
-                      <w:rFonts w:ascii="Cambria Math" w:eastAsiaTheme="minorEastAsia" w:hAnsi="Cambria Math" w:cs="Times New Roman"/>
-                    </w:rPr>
-                    <m:t>x</m:t>
-                  </m:r>
-                </m:e>
-                <m:sup>
-                  <m:r>
-                    <w:rPr>
-                      <w:rFonts w:ascii="Cambria Math" w:eastAsiaTheme="minorEastAsia" w:hAnsi="Cambria Math" w:cs="Times New Roman"/>
-                    </w:rPr>
-                    <m:t>n</m:t>
-                  </m:r>
-                </m:sup>
-              </m:sSup>
-            </m:e>
-          </m:d>
-          <m:r>
-            <w:rPr>
-              <w:rFonts w:ascii="Cambria Math" w:hAnsi="Cambria Math"/>
-            </w:rPr>
-            <m:t xml:space="preserve"> = </m:t>
-          </m:r>
-          <m:d>
-            <m:dPr>
-              <m:ctrlPr>
-                <w:rPr>
-                  <w:rFonts w:ascii="Cambria Math" w:hAnsi="Cambria Math"/>
-                  <w:i/>
-                </w:rPr>
-              </m:ctrlPr>
-            </m:dPr>
-            <m:e>
-              <m:r>
-                <w:rPr>
-                  <w:rFonts w:ascii="Cambria Math" w:hAnsi="Cambria Math"/>
-                </w:rPr>
-                <m:t xml:space="preserve">x + </m:t>
-              </m:r>
-              <m:d>
-                <m:dPr>
-                  <m:ctrlPr>
-                    <w:rPr>
-                      <w:rFonts w:ascii="Cambria Math" w:hAnsi="Cambria Math"/>
-                      <w:i/>
-                    </w:rPr>
-                  </m:ctrlPr>
-                </m:dPr>
-                <m:e>
-                  <m:r>
-                    <w:rPr>
-                      <w:rFonts w:ascii="Cambria Math" w:hAnsi="Cambria Math"/>
-                    </w:rPr>
-                    <m:t>x + 1</m:t>
-                  </m:r>
-                </m:e>
-              </m:d>
-            </m:e>
-          </m:d>
-        </m:oMath>
-      </m:oMathPara>
+      <m:oMath>
+        <m:d>
+          <m:dPr>
+            <m:ctrlPr>
+              <w:rPr>
+                <w:rFonts w:ascii="Cambria Math" w:eastAsiaTheme="minorEastAsia" w:hAnsi="Cambria Math" w:cs="Times New Roman"/>
+                <w:i/>
+              </w:rPr>
+            </m:ctrlPr>
+          </m:dPr>
+          <m:e>
+            <m:sSup>
+              <m:sSupPr>
+                <m:ctrlPr>
+                  <w:rPr>
+                    <w:rFonts w:ascii="Cambria Math" w:hAnsi="Cambria Math"/>
+                    <w:i/>
+                  </w:rPr>
+                </m:ctrlPr>
+              </m:sSupPr>
+              <m:e>
+                <m:d>
+                  <m:dPr>
+                    <m:ctrlPr>
+                      <w:rPr>
+                        <w:rFonts w:ascii="Cambria Math" w:hAnsi="Cambria Math"/>
+                        <w:i/>
+                      </w:rPr>
+                    </m:ctrlPr>
+                  </m:dPr>
+                  <m:e>
+                    <m:r>
+                      <w:rPr>
+                        <w:rFonts w:ascii="Cambria Math" w:hAnsi="Cambria Math"/>
+                      </w:rPr>
+                      <m:t>x+1</m:t>
+                    </m:r>
+                  </m:e>
+                </m:d>
+              </m:e>
+              <m:sup>
+                <m:r>
+                  <w:rPr>
+                    <w:rFonts w:ascii="Cambria Math" w:hAnsi="Cambria Math"/>
+                  </w:rPr>
+                  <m:t>n</m:t>
+                </m:r>
+              </m:sup>
+            </m:sSup>
+            <m:r>
+              <w:rPr>
+                <w:rFonts w:ascii="Cambria Math" w:hAnsi="Cambria Math"/>
+              </w:rPr>
+              <m:t xml:space="preserve"> - </m:t>
+            </m:r>
+            <m:sSup>
+              <m:sSupPr>
+                <m:ctrlPr>
+                  <w:rPr>
+                    <w:rFonts w:ascii="Cambria Math" w:eastAsiaTheme="minorEastAsia" w:hAnsi="Cambria Math" w:cs="Times New Roman"/>
+                    <w:i/>
+                  </w:rPr>
+                </m:ctrlPr>
+              </m:sSupPr>
+              <m:e>
+                <m:r>
+                  <w:rPr>
+                    <w:rFonts w:ascii="Cambria Math" w:eastAsiaTheme="minorEastAsia" w:hAnsi="Cambria Math" w:cs="Times New Roman"/>
+                  </w:rPr>
+                  <m:t>x</m:t>
+                </m:r>
+              </m:e>
+              <m:sup>
+                <m:r>
+                  <w:rPr>
+                    <w:rFonts w:ascii="Cambria Math" w:eastAsiaTheme="minorEastAsia" w:hAnsi="Cambria Math" w:cs="Times New Roman"/>
+                  </w:rPr>
+                  <m:t>n</m:t>
+                </m:r>
+              </m:sup>
+            </m:sSup>
+          </m:e>
+        </m:d>
+        <m:r>
+          <w:rPr>
+            <w:rFonts w:ascii="Cambria Math" w:hAnsi="Cambria Math"/>
+          </w:rPr>
+          <m:t xml:space="preserve"> = </m:t>
+        </m:r>
+        <m:d>
+          <m:dPr>
+            <m:ctrlPr>
+              <w:rPr>
+                <w:rFonts w:ascii="Cambria Math" w:hAnsi="Cambria Math"/>
+                <w:i/>
+              </w:rPr>
+            </m:ctrlPr>
+          </m:dPr>
+          <m:e>
+            <m:r>
+              <w:rPr>
+                <w:rFonts w:ascii="Cambria Math" w:hAnsi="Cambria Math"/>
+              </w:rPr>
+              <m:t xml:space="preserve">x + </m:t>
+            </m:r>
+            <m:d>
+              <m:dPr>
+                <m:ctrlPr>
+                  <w:rPr>
+                    <w:rFonts w:ascii="Cambria Math" w:hAnsi="Cambria Math"/>
+                    <w:i/>
+                  </w:rPr>
+                </m:ctrlPr>
+              </m:dPr>
+              <m:e>
+                <m:r>
+                  <w:rPr>
+                    <w:rFonts w:ascii="Cambria Math" w:hAnsi="Cambria Math"/>
+                  </w:rPr>
+                  <m:t>x + 1</m:t>
+                </m:r>
+              </m:e>
+            </m:d>
+          </m:e>
+        </m:d>
+      </m:oMath>
+      <w:r>
+        <w:rPr>
+          <w:rFonts w:eastAsiaTheme="minorEastAsia"/>
+        </w:rPr>
+        <w:t xml:space="preserve"> </w:t>
+      </w:r>
     </w:p>
     <w:p>
       <w:pPr>
@@ -326,139 +327,150 @@
         <w:jc w:val="center"/>
         <w:rPr>
           <w:rFonts w:eastAsiaTheme="minorEastAsia"/>
+          <w:lang w:val="id-ID"/>
         </w:rPr>
       </w:pPr>
-      <m:oMathPara>
-        <m:oMathParaPr>
-          <m:jc m:val="center"/>
-        </m:oMathParaPr>
-        <m:oMath>
-          <m:d>
-            <m:dPr>
-              <m:ctrlPr>
-                <w:rPr>
-                  <w:rFonts w:ascii="Cambria Math" w:eastAsiaTheme="minorEastAsia" w:hAnsi="Cambria Math" w:cs="Times New Roman"/>
-                  <w:i/>
-                </w:rPr>
-              </m:ctrlPr>
-            </m:dPr>
-            <m:e>
-              <m:sSup>
-                <m:sSupPr>
-                  <m:ctrlPr>
-                    <w:rPr>
-                      <w:rFonts w:ascii="Cambria Math" w:hAnsi="Cambria Math"/>
-                      <w:i/>
-                    </w:rPr>
-                  </m:ctrlPr>
-                </m:sSupPr>
-                <m:e>
-                  <m:d>
-                    <m:dPr>
-                      <m:ctrlPr>
-                        <w:rPr>
-                          <w:rFonts w:ascii="Cambria Math" w:hAnsi="Cambria Math"/>
-                          <w:i/>
-                        </w:rPr>
-                      </m:ctrlPr>
-                    </m:dPr>
-                    <m:e>
-                      <m:r>
-                        <w:rPr>
-                          <w:rFonts w:ascii="Cambria Math" w:hAnsi="Cambria Math"/>
-                        </w:rPr>
-                        <m:t>x+1</m:t>
-                      </m:r>
-                    </m:e>
-                  </m:d>
-                </m:e>
-                <m:sup>
-                  <m:r>
-                    <w:rPr>
-                      <w:rFonts w:ascii="Cambria Math" w:hAnsi="Cambria Math"/>
-                    </w:rPr>
-                    <m:t>n</m:t>
-                  </m:r>
-                </m:sup>
-              </m:sSup>
-              <m:r>
-                <w:rPr>
-                  <w:rFonts w:ascii="Cambria Math" w:hAnsi="Cambria Math"/>
-                </w:rPr>
-                <m:t xml:space="preserve"> - </m:t>
-              </m:r>
-              <m:sSup>
-                <m:sSupPr>
-                  <m:ctrlPr>
-                    <w:rPr>
-                      <w:rFonts w:ascii="Cambria Math" w:eastAsiaTheme="minorEastAsia" w:hAnsi="Cambria Math" w:cs="Times New Roman"/>
-                      <w:i/>
-                    </w:rPr>
-                  </m:ctrlPr>
-                </m:sSupPr>
-                <m:e>
-                  <m:r>
-                    <w:rPr>
-                      <w:rFonts w:ascii="Cambria Math" w:eastAsiaTheme="minorEastAsia" w:hAnsi="Cambria Math" w:cs="Times New Roman"/>
-                    </w:rPr>
-                    <m:t>x</m:t>
-                  </m:r>
-                </m:e>
-                <m:sup>
-                  <m:r>
-                    <w:rPr>
-                      <w:rFonts w:ascii="Cambria Math" w:eastAsiaTheme="minorEastAsia" w:hAnsi="Cambria Math" w:cs="Times New Roman"/>
-                    </w:rPr>
-                    <m:t>n</m:t>
-                  </m:r>
-                </m:sup>
-              </m:sSup>
-            </m:e>
-          </m:d>
-          <m:r>
-            <w:rPr>
-              <w:rFonts w:ascii="Cambria Math" w:hAnsi="Cambria Math"/>
-            </w:rPr>
-            <m:t xml:space="preserve"> = </m:t>
-          </m:r>
-          <m:d>
-            <m:dPr>
-              <m:ctrlPr>
-                <w:rPr>
-                  <w:rFonts w:ascii="Cambria Math" w:hAnsi="Cambria Math"/>
-                  <w:i/>
-                </w:rPr>
-              </m:ctrlPr>
-            </m:dPr>
-            <m:e>
-              <m:d>
-                <m:dPr>
-                  <m:ctrlPr>
-                    <w:rPr>
-                      <w:rFonts w:ascii="Cambria Math" w:hAnsi="Cambria Math"/>
-                      <w:i/>
-                    </w:rPr>
-                  </m:ctrlPr>
-                </m:dPr>
-                <m:e>
-                  <m:r>
-                    <w:rPr>
-                      <w:rFonts w:ascii="Cambria Math" w:hAnsi="Cambria Math"/>
-                    </w:rPr>
-                    <m:t>2 × x</m:t>
-                  </m:r>
-                </m:e>
-              </m:d>
-              <m:r>
-                <w:rPr>
-                  <w:rFonts w:ascii="Cambria Math" w:hAnsi="Cambria Math"/>
-                </w:rPr>
-                <m:t xml:space="preserve"> + 1</m:t>
-              </m:r>
-            </m:e>
-          </m:d>
-        </m:oMath>
-      </m:oMathPara>
+      <m:oMath>
+        <m:d>
+          <m:dPr>
+            <m:ctrlPr>
+              <w:rPr>
+                <w:rFonts w:ascii="Cambria Math" w:eastAsiaTheme="minorEastAsia" w:hAnsi="Cambria Math" w:cs="Times New Roman"/>
+                <w:i/>
+              </w:rPr>
+            </m:ctrlPr>
+          </m:dPr>
+          <m:e>
+            <m:sSup>
+              <m:sSupPr>
+                <m:ctrlPr>
+                  <w:rPr>
+                    <w:rFonts w:ascii="Cambria Math" w:hAnsi="Cambria Math"/>
+                    <w:i/>
+                  </w:rPr>
+                </m:ctrlPr>
+              </m:sSupPr>
+              <m:e>
+                <m:d>
+                  <m:dPr>
+                    <m:ctrlPr>
+                      <w:rPr>
+                        <w:rFonts w:ascii="Cambria Math" w:hAnsi="Cambria Math"/>
+                        <w:i/>
+                      </w:rPr>
+                    </m:ctrlPr>
+                  </m:dPr>
+                  <m:e>
+                    <m:r>
+                      <w:rPr>
+                        <w:rFonts w:ascii="Cambria Math" w:hAnsi="Cambria Math"/>
+                        <w:lang w:val="id-ID"/>
+                      </w:rPr>
+                      <m:t>x+1</m:t>
+                    </m:r>
+                  </m:e>
+                </m:d>
+              </m:e>
+              <m:sup>
+                <m:r>
+                  <w:rPr>
+                    <w:rFonts w:ascii="Cambria Math" w:hAnsi="Cambria Math"/>
+                    <w:lang w:val="id-ID"/>
+                  </w:rPr>
+                  <m:t>n</m:t>
+                </m:r>
+              </m:sup>
+            </m:sSup>
+            <m:r>
+              <w:rPr>
+                <w:rFonts w:ascii="Cambria Math" w:hAnsi="Cambria Math"/>
+                <w:lang w:val="id-ID"/>
+              </w:rPr>
+              <m:t xml:space="preserve"> - </m:t>
+            </m:r>
+            <m:sSup>
+              <m:sSupPr>
+                <m:ctrlPr>
+                  <w:rPr>
+                    <w:rFonts w:ascii="Cambria Math" w:eastAsiaTheme="minorEastAsia" w:hAnsi="Cambria Math" w:cs="Times New Roman"/>
+                    <w:i/>
+                  </w:rPr>
+                </m:ctrlPr>
+              </m:sSupPr>
+              <m:e>
+                <m:r>
+                  <w:rPr>
+                    <w:rFonts w:ascii="Cambria Math" w:eastAsiaTheme="minorEastAsia" w:hAnsi="Cambria Math" w:cs="Times New Roman"/>
+                    <w:lang w:val="id-ID"/>
+                  </w:rPr>
+                  <m:t>x</m:t>
+                </m:r>
+              </m:e>
+              <m:sup>
+                <m:r>
+                  <w:rPr>
+                    <w:rFonts w:ascii="Cambria Math" w:eastAsiaTheme="minorEastAsia" w:hAnsi="Cambria Math" w:cs="Times New Roman"/>
+                    <w:lang w:val="id-ID"/>
+                  </w:rPr>
+                  <m:t>n</m:t>
+                </m:r>
+              </m:sup>
+            </m:sSup>
+          </m:e>
+        </m:d>
+        <m:r>
+          <w:rPr>
+            <w:rFonts w:ascii="Cambria Math" w:hAnsi="Cambria Math"/>
+            <w:lang w:val="id-ID"/>
+          </w:rPr>
+          <m:t xml:space="preserve"> = </m:t>
+        </m:r>
+        <m:d>
+          <m:dPr>
+            <m:ctrlPr>
+              <w:rPr>
+                <w:rFonts w:ascii="Cambria Math" w:hAnsi="Cambria Math"/>
+                <w:i/>
+              </w:rPr>
+            </m:ctrlPr>
+          </m:dPr>
+          <m:e>
+            <m:d>
+              <m:dPr>
+                <m:ctrlPr>
+                  <w:rPr>
+                    <w:rFonts w:ascii="Cambria Math" w:hAnsi="Cambria Math"/>
+                    <w:i/>
+                  </w:rPr>
+                </m:ctrlPr>
+              </m:dPr>
+              <m:e>
+                <m:r>
+                  <w:rPr>
+                    <w:rFonts w:ascii="Cambria Math" w:hAnsi="Cambria Math"/>
+                    <w:lang w:val="id-ID"/>
+                  </w:rPr>
+                  <m:t>2 × x</m:t>
+                </m:r>
+              </m:e>
+            </m:d>
+            <m:r>
+              <w:rPr>
+                <w:rFonts w:ascii="Cambria Math" w:hAnsi="Cambria Math"/>
+                <w:lang w:val="id-ID"/>
+              </w:rPr>
+              <m:t xml:space="preserve"> + 1</m:t>
+            </m:r>
+          </m:e>
+        </m:d>
+      </m:oMath>
+      <w:r>
+        <w:rPr>
+          <w:rFonts w:eastAsiaTheme="minorEastAsia"/>
+          <w:lang w:val="id-ID"/>
+        </w:rPr>
+        <w:t xml:space="preserve"> </w:t>
+      </w:r>
     </w:p>
     <w:p>
       <w:pPr>
@@ -466,6 +478,7 @@
         <w:jc w:val="center"/>
         <w:rPr>
           <w:rFonts w:ascii="Times New Roman" w:eastAsiaTheme="minorEastAsia" w:hAnsi="Times New Roman" w:cs="Times New Roman"/>
+          <w:lang w:val="id-ID"/>
         </w:rPr>
       </w:pPr>
     </w:p>
@@ -475,240 +488,260 @@
         <w:jc w:val="center"/>
         <w:rPr>
           <w:rFonts w:eastAsiaTheme="minorEastAsia"/>
+          <w:lang w:val="id-ID"/>
         </w:rPr>
       </w:pPr>
-      <m:oMathPara>
-        <m:oMath>
-          <m:d>
-            <m:dPr>
-              <m:ctrlPr>
-                <w:rPr>
-                  <w:rFonts w:ascii="Cambria Math" w:eastAsiaTheme="minorEastAsia" w:hAnsi="Cambria Math" w:cs="Times New Roman"/>
-                  <w:i/>
-                </w:rPr>
-              </m:ctrlPr>
-            </m:dPr>
-            <m:e>
-              <m:sSup>
-                <m:sSupPr>
-                  <m:ctrlPr>
-                    <w:rPr>
-                      <w:rFonts w:ascii="Cambria Math" w:hAnsi="Cambria Math"/>
-                      <w:i/>
-                    </w:rPr>
-                  </m:ctrlPr>
-                </m:sSupPr>
-                <m:e>
-                  <m:d>
-                    <m:dPr>
-                      <m:ctrlPr>
-                        <w:rPr>
-                          <w:rFonts w:ascii="Cambria Math" w:hAnsi="Cambria Math"/>
-                          <w:i/>
-                        </w:rPr>
-                      </m:ctrlPr>
-                    </m:dPr>
-                    <m:e>
-                      <m:r>
-                        <w:rPr>
-                          <w:rFonts w:ascii="Cambria Math" w:hAnsi="Cambria Math"/>
-                        </w:rPr>
-                        <m:t>E + x</m:t>
-                      </m:r>
-                    </m:e>
-                  </m:d>
-                </m:e>
-                <m:sup>
-                  <m:r>
-                    <w:rPr>
-                      <w:rFonts w:ascii="Cambria Math" w:hAnsi="Cambria Math"/>
-                    </w:rPr>
-                    <m:t>n</m:t>
-                  </m:r>
-                </m:sup>
-              </m:sSup>
-              <m:r>
-                <w:rPr>
-                  <w:rFonts w:ascii="Cambria Math" w:hAnsi="Cambria Math"/>
-                </w:rPr>
-                <m:t xml:space="preserve"> - </m:t>
-              </m:r>
-              <m:sSup>
-                <m:sSupPr>
-                  <m:ctrlPr>
-                    <w:rPr>
-                      <w:rFonts w:ascii="Cambria Math" w:eastAsiaTheme="minorEastAsia" w:hAnsi="Cambria Math" w:cs="Times New Roman"/>
-                      <w:i/>
-                    </w:rPr>
-                  </m:ctrlPr>
-                </m:sSupPr>
-                <m:e>
-                  <m:r>
-                    <w:rPr>
-                      <w:rFonts w:ascii="Cambria Math" w:eastAsiaTheme="minorEastAsia" w:hAnsi="Cambria Math" w:cs="Times New Roman"/>
-                    </w:rPr>
-                    <m:t>E</m:t>
-                  </m:r>
-                </m:e>
-                <m:sup>
-                  <m:r>
-                    <w:rPr>
-                      <w:rFonts w:ascii="Cambria Math" w:eastAsiaTheme="minorEastAsia" w:hAnsi="Cambria Math" w:cs="Times New Roman"/>
-                    </w:rPr>
-                    <m:t>n</m:t>
-                  </m:r>
-                </m:sup>
-              </m:sSup>
-            </m:e>
-          </m:d>
-          <m:r>
-            <w:rPr>
-              <w:rFonts w:ascii="Cambria Math" w:hAnsi="Cambria Math"/>
-            </w:rPr>
-            <m:t xml:space="preserve"> = </m:t>
-          </m:r>
-          <m:d>
-            <m:dPr>
-              <m:ctrlPr>
-                <w:rPr>
-                  <w:rFonts w:ascii="Cambria Math" w:hAnsi="Cambria Math"/>
-                  <w:i/>
-                </w:rPr>
-              </m:ctrlPr>
-            </m:dPr>
-            <m:e>
-              <m:sSup>
-                <m:sSupPr>
-                  <m:ctrlPr>
-                    <w:rPr>
-                      <w:rFonts w:ascii="Cambria Math" w:hAnsi="Cambria Math"/>
-                      <w:i/>
-                    </w:rPr>
-                  </m:ctrlPr>
-                </m:sSupPr>
-                <m:e>
-                  <m:r>
-                    <w:rPr>
-                      <w:rFonts w:ascii="Cambria Math" w:hAnsi="Cambria Math"/>
-                    </w:rPr>
-                    <m:t>x</m:t>
-                  </m:r>
-                </m:e>
-                <m:sup>
-                  <m:r>
-                    <w:rPr>
-                      <w:rFonts w:ascii="Cambria Math" w:hAnsi="Cambria Math"/>
-                    </w:rPr>
-                    <m:t>n</m:t>
-                  </m:r>
-                </m:sup>
-              </m:sSup>
-              <m:r>
-                <w:rPr>
-                  <w:rFonts w:ascii="Cambria Math" w:hAnsi="Cambria Math"/>
-                </w:rPr>
-                <m:t xml:space="preserve"> + </m:t>
-              </m:r>
-              <m:d>
-                <m:dPr>
-                  <m:begChr m:val="{"/>
-                  <m:endChr m:val="}"/>
-                  <m:ctrlPr>
-                    <w:rPr>
-                      <w:rFonts w:ascii="Cambria Math" w:hAnsi="Cambria Math"/>
-                      <w:i/>
-                    </w:rPr>
-                  </m:ctrlPr>
-                </m:dPr>
-                <m:e>
-                  <m:r>
-                    <w:rPr>
-                      <w:rFonts w:ascii="Cambria Math" w:hAnsi="Cambria Math"/>
-                    </w:rPr>
-                    <m:t>x × E × n</m:t>
-                  </m:r>
-                </m:e>
-              </m:d>
-              <m:r>
-                <w:rPr>
-                  <w:rFonts w:ascii="Cambria Math" w:hAnsi="Cambria Math"/>
-                </w:rPr>
-                <m:t xml:space="preserve"> - </m:t>
-              </m:r>
-              <m:sSup>
-                <m:sSupPr>
-                  <m:ctrlPr>
-                    <w:rPr>
-                      <w:rFonts w:ascii="Cambria Math" w:hAnsi="Cambria Math"/>
-                      <w:i/>
-                    </w:rPr>
-                  </m:ctrlPr>
-                </m:sSupPr>
-                <m:e>
-                  <m:d>
-                    <m:dPr>
-                      <m:begChr m:val="{"/>
-                      <m:endChr m:val="}"/>
-                      <m:ctrlPr>
-                        <w:rPr>
-                          <w:rFonts w:ascii="Cambria Math" w:hAnsi="Cambria Math"/>
-                          <w:i/>
-                        </w:rPr>
-                      </m:ctrlPr>
-                    </m:dPr>
-                    <m:e>
-                      <m:r>
-                        <w:rPr>
-                          <w:rFonts w:ascii="Cambria Math" w:hAnsi="Cambria Math"/>
-                        </w:rPr>
-                        <m:t xml:space="preserve">E × </m:t>
-                      </m:r>
-                      <m:d>
-                        <m:dPr>
-                          <m:ctrlPr>
-                            <w:rPr>
-                              <w:rFonts w:ascii="Cambria Math" w:hAnsi="Cambria Math"/>
-                              <w:i/>
-                            </w:rPr>
-                          </m:ctrlPr>
-                        </m:dPr>
-                        <m:e>
-                          <m:r>
-                            <w:rPr>
-                              <w:rFonts w:ascii="Cambria Math" w:hAnsi="Cambria Math"/>
-                            </w:rPr>
-                            <m:t>x - E</m:t>
-                          </m:r>
-                        </m:e>
-                      </m:d>
-                    </m:e>
-                  </m:d>
-                </m:e>
-                <m:sup>
-                  <m:d>
-                    <m:dPr>
-                      <m:ctrlPr>
-                        <w:rPr>
-                          <w:rFonts w:ascii="Cambria Math" w:hAnsi="Cambria Math"/>
-                          <w:i/>
-                        </w:rPr>
-                      </m:ctrlPr>
-                    </m:dPr>
-                    <m:e>
-                      <m:r>
-                        <w:rPr>
-                          <w:rFonts w:ascii="Cambria Math" w:hAnsi="Cambria Math"/>
-                        </w:rPr>
-                        <m:t>n - 1</m:t>
-                      </m:r>
-                    </m:e>
-                  </m:d>
-                </m:sup>
-              </m:sSup>
-            </m:e>
-          </m:d>
-        </m:oMath>
-      </m:oMathPara>
+      <m:oMath>
+        <m:d>
+          <m:dPr>
+            <m:ctrlPr>
+              <w:rPr>
+                <w:rFonts w:ascii="Cambria Math" w:eastAsiaTheme="minorEastAsia" w:hAnsi="Cambria Math" w:cs="Times New Roman"/>
+                <w:i/>
+              </w:rPr>
+            </m:ctrlPr>
+          </m:dPr>
+          <m:e>
+            <m:sSup>
+              <m:sSupPr>
+                <m:ctrlPr>
+                  <w:rPr>
+                    <w:rFonts w:ascii="Cambria Math" w:hAnsi="Cambria Math"/>
+                    <w:i/>
+                  </w:rPr>
+                </m:ctrlPr>
+              </m:sSupPr>
+              <m:e>
+                <m:d>
+                  <m:dPr>
+                    <m:ctrlPr>
+                      <w:rPr>
+                        <w:rFonts w:ascii="Cambria Math" w:hAnsi="Cambria Math"/>
+                        <w:i/>
+                      </w:rPr>
+                    </m:ctrlPr>
+                  </m:dPr>
+                  <m:e>
+                    <m:r>
+                      <w:rPr>
+                        <w:rFonts w:ascii="Cambria Math" w:hAnsi="Cambria Math"/>
+                        <w:lang w:val="id-ID"/>
+                      </w:rPr>
+                      <m:t>E + x</m:t>
+                    </m:r>
+                  </m:e>
+                </m:d>
+              </m:e>
+              <m:sup>
+                <m:r>
+                  <w:rPr>
+                    <w:rFonts w:ascii="Cambria Math" w:hAnsi="Cambria Math"/>
+                    <w:lang w:val="id-ID"/>
+                  </w:rPr>
+                  <m:t>n</m:t>
+                </m:r>
+              </m:sup>
+            </m:sSup>
+            <m:r>
+              <w:rPr>
+                <w:rFonts w:ascii="Cambria Math" w:hAnsi="Cambria Math"/>
+                <w:lang w:val="id-ID"/>
+              </w:rPr>
+              <m:t xml:space="preserve"> - </m:t>
+            </m:r>
+            <m:sSup>
+              <m:sSupPr>
+                <m:ctrlPr>
+                  <w:rPr>
+                    <w:rFonts w:ascii="Cambria Math" w:eastAsiaTheme="minorEastAsia" w:hAnsi="Cambria Math" w:cs="Times New Roman"/>
+                    <w:i/>
+                  </w:rPr>
+                </m:ctrlPr>
+              </m:sSupPr>
+              <m:e>
+                <m:r>
+                  <w:rPr>
+                    <w:rFonts w:ascii="Cambria Math" w:eastAsiaTheme="minorEastAsia" w:hAnsi="Cambria Math" w:cs="Times New Roman"/>
+                    <w:lang w:val="id-ID"/>
+                  </w:rPr>
+                  <m:t>E</m:t>
+                </m:r>
+              </m:e>
+              <m:sup>
+                <m:r>
+                  <w:rPr>
+                    <w:rFonts w:ascii="Cambria Math" w:eastAsiaTheme="minorEastAsia" w:hAnsi="Cambria Math" w:cs="Times New Roman"/>
+                    <w:lang w:val="id-ID"/>
+                  </w:rPr>
+                  <m:t>n</m:t>
+                </m:r>
+              </m:sup>
+            </m:sSup>
+          </m:e>
+        </m:d>
+        <m:r>
+          <w:rPr>
+            <w:rFonts w:ascii="Cambria Math" w:hAnsi="Cambria Math"/>
+            <w:lang w:val="id-ID"/>
+          </w:rPr>
+          <m:t xml:space="preserve"> = </m:t>
+        </m:r>
+        <m:d>
+          <m:dPr>
+            <m:ctrlPr>
+              <w:rPr>
+                <w:rFonts w:ascii="Cambria Math" w:hAnsi="Cambria Math"/>
+                <w:i/>
+              </w:rPr>
+            </m:ctrlPr>
+          </m:dPr>
+          <m:e>
+            <m:sSup>
+              <m:sSupPr>
+                <m:ctrlPr>
+                  <w:rPr>
+                    <w:rFonts w:ascii="Cambria Math" w:hAnsi="Cambria Math"/>
+                    <w:i/>
+                  </w:rPr>
+                </m:ctrlPr>
+              </m:sSupPr>
+              <m:e>
+                <m:r>
+                  <w:rPr>
+                    <w:rFonts w:ascii="Cambria Math" w:hAnsi="Cambria Math"/>
+                    <w:lang w:val="id-ID"/>
+                  </w:rPr>
+                  <m:t>x</m:t>
+                </m:r>
+              </m:e>
+              <m:sup>
+                <m:r>
+                  <w:rPr>
+                    <w:rFonts w:ascii="Cambria Math" w:hAnsi="Cambria Math"/>
+                    <w:lang w:val="id-ID"/>
+                  </w:rPr>
+                  <m:t>n</m:t>
+                </m:r>
+              </m:sup>
+            </m:sSup>
+            <m:r>
+              <w:rPr>
+                <w:rFonts w:ascii="Cambria Math" w:hAnsi="Cambria Math"/>
+                <w:lang w:val="id-ID"/>
+              </w:rPr>
+              <m:t xml:space="preserve"> + </m:t>
+            </m:r>
+            <m:d>
+              <m:dPr>
+                <m:begChr m:val="{"/>
+                <m:endChr m:val="}"/>
+                <m:ctrlPr>
+                  <w:rPr>
+                    <w:rFonts w:ascii="Cambria Math" w:hAnsi="Cambria Math"/>
+                    <w:i/>
+                  </w:rPr>
+                </m:ctrlPr>
+              </m:dPr>
+              <m:e>
+                <m:r>
+                  <w:rPr>
+                    <w:rFonts w:ascii="Cambria Math" w:hAnsi="Cambria Math"/>
+                    <w:lang w:val="id-ID"/>
+                  </w:rPr>
+                  <m:t>x × E × n</m:t>
+                </m:r>
+              </m:e>
+            </m:d>
+            <m:r>
+              <w:rPr>
+                <w:rFonts w:ascii="Cambria Math" w:hAnsi="Cambria Math"/>
+                <w:lang w:val="id-ID"/>
+              </w:rPr>
+              <m:t xml:space="preserve"> - </m:t>
+            </m:r>
+            <m:sSup>
+              <m:sSupPr>
+                <m:ctrlPr>
+                  <w:rPr>
+                    <w:rFonts w:ascii="Cambria Math" w:hAnsi="Cambria Math"/>
+                    <w:i/>
+                  </w:rPr>
+                </m:ctrlPr>
+              </m:sSupPr>
+              <m:e>
+                <m:d>
+                  <m:dPr>
+                    <m:begChr m:val="{"/>
+                    <m:endChr m:val="}"/>
+                    <m:ctrlPr>
+                      <w:rPr>
+                        <w:rFonts w:ascii="Cambria Math" w:hAnsi="Cambria Math"/>
+                        <w:i/>
+                      </w:rPr>
+                    </m:ctrlPr>
+                  </m:dPr>
+                  <m:e>
+                    <m:r>
+                      <w:rPr>
+                        <w:rFonts w:ascii="Cambria Math" w:hAnsi="Cambria Math"/>
+                        <w:lang w:val="id-ID"/>
+                      </w:rPr>
+                      <m:t xml:space="preserve">E × </m:t>
+                    </m:r>
+                    <m:d>
+                      <m:dPr>
+                        <m:ctrlPr>
+                          <w:rPr>
+                            <w:rFonts w:ascii="Cambria Math" w:hAnsi="Cambria Math"/>
+                            <w:i/>
+                          </w:rPr>
+                        </m:ctrlPr>
+                      </m:dPr>
+                      <m:e>
+                        <m:r>
+                          <w:rPr>
+                            <w:rFonts w:ascii="Cambria Math" w:hAnsi="Cambria Math"/>
+                            <w:lang w:val="id-ID"/>
+                          </w:rPr>
+                          <m:t>x - E</m:t>
+                        </m:r>
+                      </m:e>
+                    </m:d>
+                  </m:e>
+                </m:d>
+              </m:e>
+              <m:sup>
+                <m:d>
+                  <m:dPr>
+                    <m:ctrlPr>
+                      <w:rPr>
+                        <w:rFonts w:ascii="Cambria Math" w:hAnsi="Cambria Math"/>
+                        <w:i/>
+                      </w:rPr>
+                    </m:ctrlPr>
+                  </m:dPr>
+                  <m:e>
+                    <m:r>
+                      <w:rPr>
+                        <w:rFonts w:ascii="Cambria Math" w:hAnsi="Cambria Math"/>
+                        <w:lang w:val="id-ID"/>
+                      </w:rPr>
+                      <m:t>n - 1</m:t>
+                    </m:r>
+                  </m:e>
+                </m:d>
+              </m:sup>
+            </m:sSup>
+          </m:e>
+        </m:d>
+      </m:oMath>
+      <w:r>
+        <w:rPr>
+          <w:rFonts w:eastAsiaTheme="minorEastAsia"/>
+          <w:lang w:val="id-ID"/>
+        </w:rPr>
+        <w:t xml:space="preserve"> </w:t>
+      </w:r>
     </w:p>
     <w:p>
       <w:pPr>
@@ -716,6 +749,7 @@
         <w:jc w:val="center"/>
         <w:rPr>
           <w:rFonts w:ascii="Times New Roman" w:eastAsiaTheme="minorEastAsia" w:hAnsi="Times New Roman" w:cs="Times New Roman"/>
+          <w:lang w:val="id-ID"/>
         </w:rPr>
       </w:pPr>
     </w:p>
@@ -723,283 +757,309 @@
       <w:pPr>
         <w:spacing w:line="360" w:lineRule="auto"/>
         <w:jc w:val="center"/>
+        <w:rPr>
+          <w:rFonts w:ascii="Times New Roman" w:hAnsi="Times New Roman" w:cs="Times New Roman"/>
+          <w:lang w:val="id-ID"/>
+        </w:rPr>
       </w:pPr>
-      <m:oMathPara>
-        <m:oMath>
-          <m:d>
-            <m:dPr>
-              <m:ctrlPr>
-                <w:rPr>
-                  <w:rFonts w:ascii="Cambria Math" w:eastAsiaTheme="minorEastAsia" w:hAnsi="Cambria Math" w:cs="Times New Roman"/>
-                  <w:i/>
-                </w:rPr>
-              </m:ctrlPr>
-            </m:dPr>
-            <m:e>
-              <m:sSup>
-                <m:sSupPr>
-                  <m:ctrlPr>
-                    <w:rPr>
-                      <w:rFonts w:ascii="Cambria Math" w:hAnsi="Cambria Math"/>
-                      <w:i/>
-                    </w:rPr>
-                  </m:ctrlPr>
-                </m:sSupPr>
-                <m:e>
-                  <m:d>
-                    <m:dPr>
-                      <m:ctrlPr>
-                        <w:rPr>
-                          <w:rFonts w:ascii="Cambria Math" w:hAnsi="Cambria Math"/>
-                          <w:i/>
-                        </w:rPr>
-                      </m:ctrlPr>
-                    </m:dPr>
-                    <m:e>
-                      <m:r>
-                        <w:rPr>
-                          <w:rFonts w:ascii="Cambria Math" w:hAnsi="Cambria Math"/>
-                        </w:rPr>
-                        <m:t>E + x</m:t>
-                      </m:r>
-                    </m:e>
-                  </m:d>
-                </m:e>
-                <m:sup>
-                  <m:r>
-                    <w:rPr>
-                      <w:rFonts w:ascii="Cambria Math" w:hAnsi="Cambria Math"/>
-                    </w:rPr>
-                    <m:t>n</m:t>
-                  </m:r>
-                </m:sup>
-              </m:sSup>
-              <m:r>
-                <w:rPr>
-                  <w:rFonts w:ascii="Cambria Math" w:hAnsi="Cambria Math"/>
-                </w:rPr>
-                <m:t xml:space="preserve"> - </m:t>
-              </m:r>
-              <m:sSup>
-                <m:sSupPr>
-                  <m:ctrlPr>
-                    <w:rPr>
-                      <w:rFonts w:ascii="Cambria Math" w:eastAsiaTheme="minorEastAsia" w:hAnsi="Cambria Math" w:cs="Times New Roman"/>
-                      <w:i/>
-                    </w:rPr>
-                  </m:ctrlPr>
-                </m:sSupPr>
-                <m:e>
-                  <m:r>
-                    <w:rPr>
-                      <w:rFonts w:ascii="Cambria Math" w:eastAsiaTheme="minorEastAsia" w:hAnsi="Cambria Math" w:cs="Times New Roman"/>
-                    </w:rPr>
-                    <m:t>E</m:t>
-                  </m:r>
-                </m:e>
-                <m:sup>
-                  <m:r>
-                    <w:rPr>
-                      <w:rFonts w:ascii="Cambria Math" w:eastAsiaTheme="minorEastAsia" w:hAnsi="Cambria Math" w:cs="Times New Roman"/>
-                    </w:rPr>
-                    <m:t>n</m:t>
-                  </m:r>
-                </m:sup>
-              </m:sSup>
-            </m:e>
-          </m:d>
-          <m:r>
-            <w:rPr>
-              <w:rFonts w:ascii="Cambria Math" w:hAnsi="Cambria Math"/>
-            </w:rPr>
-            <m:t xml:space="preserve"> = </m:t>
-          </m:r>
-          <m:d>
-            <m:dPr>
-              <m:ctrlPr>
-                <w:rPr>
-                  <w:rFonts w:ascii="Cambria Math" w:hAnsi="Cambria Math"/>
-                  <w:i/>
-                </w:rPr>
-              </m:ctrlPr>
-            </m:dPr>
-            <m:e>
-              <m:sSup>
-                <m:sSupPr>
-                  <m:ctrlPr>
-                    <w:rPr>
-                      <w:rFonts w:ascii="Cambria Math" w:hAnsi="Cambria Math"/>
-                      <w:i/>
-                    </w:rPr>
-                  </m:ctrlPr>
-                </m:sSupPr>
-                <m:e>
-                  <m:r>
-                    <w:rPr>
-                      <w:rFonts w:ascii="Cambria Math" w:hAnsi="Cambria Math"/>
-                    </w:rPr>
-                    <m:t>x</m:t>
-                  </m:r>
-                </m:e>
-                <m:sup>
-                  <m:r>
-                    <w:rPr>
-                      <w:rFonts w:ascii="Cambria Math" w:hAnsi="Cambria Math"/>
-                    </w:rPr>
-                    <m:t>n</m:t>
-                  </m:r>
-                </m:sup>
-              </m:sSup>
-              <m:r>
-                <w:rPr>
-                  <w:rFonts w:ascii="Cambria Math" w:hAnsi="Cambria Math"/>
-                </w:rPr>
-                <m:t xml:space="preserve"> + </m:t>
-              </m:r>
-              <m:d>
-                <m:dPr>
-                  <m:begChr m:val="{"/>
-                  <m:endChr m:val="}"/>
-                  <m:ctrlPr>
-                    <w:rPr>
-                      <w:rFonts w:ascii="Cambria Math" w:hAnsi="Cambria Math"/>
-                      <w:i/>
-                    </w:rPr>
-                  </m:ctrlPr>
-                </m:dPr>
-                <m:e>
-                  <m:r>
-                    <w:rPr>
-                      <w:rFonts w:ascii="Cambria Math" w:hAnsi="Cambria Math"/>
-                    </w:rPr>
-                    <m:t>x × E × n</m:t>
-                  </m:r>
-                </m:e>
-              </m:d>
-              <m:r>
-                <w:rPr>
-                  <w:rFonts w:ascii="Cambria Math" w:hAnsi="Cambria Math"/>
-                </w:rPr>
-                <m:t xml:space="preserve"> - </m:t>
-              </m:r>
-              <m:sSup>
-                <m:sSupPr>
-                  <m:ctrlPr>
-                    <w:rPr>
-                      <w:rFonts w:ascii="Cambria Math" w:hAnsi="Cambria Math"/>
-                      <w:i/>
-                    </w:rPr>
-                  </m:ctrlPr>
-                </m:sSupPr>
-                <m:e>
-                  <m:d>
-                    <m:dPr>
-                      <m:begChr m:val="{"/>
-                      <m:endChr m:val="}"/>
-                      <m:ctrlPr>
-                        <w:rPr>
-                          <w:rFonts w:ascii="Cambria Math" w:hAnsi="Cambria Math"/>
-                          <w:i/>
-                        </w:rPr>
-                      </m:ctrlPr>
-                    </m:dPr>
-                    <m:e>
-                      <m:r>
-                        <w:rPr>
-                          <w:rFonts w:ascii="Cambria Math" w:hAnsi="Cambria Math"/>
-                        </w:rPr>
-                        <m:t>E × x</m:t>
-                      </m:r>
-                    </m:e>
-                  </m:d>
-                </m:e>
-                <m:sup>
-                  <m:d>
-                    <m:dPr>
-                      <m:ctrlPr>
-                        <w:rPr>
-                          <w:rFonts w:ascii="Cambria Math" w:hAnsi="Cambria Math"/>
-                          <w:i/>
-                        </w:rPr>
-                      </m:ctrlPr>
-                    </m:dPr>
-                    <m:e>
-                      <m:r>
-                        <w:rPr>
-                          <w:rFonts w:ascii="Cambria Math" w:hAnsi="Cambria Math"/>
-                        </w:rPr>
-                        <m:t>n - 1</m:t>
-                      </m:r>
-                    </m:e>
-                  </m:d>
-                </m:sup>
-              </m:sSup>
-              <m:r>
-                <w:rPr>
-                  <w:rFonts w:ascii="Cambria Math" w:hAnsi="Cambria Math"/>
-                </w:rPr>
-                <m:t xml:space="preserve"> + </m:t>
-              </m:r>
-              <m:sSup>
-                <m:sSupPr>
-                  <m:ctrlPr>
-                    <w:rPr>
-                      <w:rFonts w:ascii="Cambria Math" w:hAnsi="Cambria Math"/>
-                      <w:i/>
-                    </w:rPr>
-                  </m:ctrlPr>
-                </m:sSupPr>
-                <m:e>
-                  <m:r>
-                    <w:rPr>
-                      <w:rFonts w:ascii="Cambria Math" w:hAnsi="Cambria Math"/>
-                    </w:rPr>
-                    <m:t>E</m:t>
-                  </m:r>
-                </m:e>
-                <m:sup>
-                  <m:d>
-                    <m:dPr>
-                      <m:ctrlPr>
-                        <w:rPr>
-                          <w:rFonts w:ascii="Cambria Math" w:hAnsi="Cambria Math"/>
-                          <w:i/>
-                        </w:rPr>
-                      </m:ctrlPr>
-                    </m:dPr>
-                    <m:e>
-                      <m:d>
-                        <m:dPr>
-                          <m:ctrlPr>
-                            <w:rPr>
-                              <w:rFonts w:ascii="Cambria Math" w:hAnsi="Cambria Math"/>
-                              <w:i/>
-                            </w:rPr>
-                          </m:ctrlPr>
-                        </m:dPr>
-                        <m:e>
-                          <m:r>
-                            <w:rPr>
-                              <w:rFonts w:ascii="Cambria Math" w:hAnsi="Cambria Math"/>
-                            </w:rPr>
-                            <m:t>2 × n</m:t>
-                          </m:r>
-                        </m:e>
-                      </m:d>
-                      <m:r>
-                        <w:rPr>
-                          <w:rFonts w:ascii="Cambria Math" w:hAnsi="Cambria Math"/>
-                        </w:rPr>
-                        <m:t xml:space="preserve"> - 1</m:t>
-                      </m:r>
-                    </m:e>
-                  </m:d>
-                </m:sup>
-              </m:sSup>
-            </m:e>
-          </m:d>
-        </m:oMath>
-      </m:oMathPara>
+      <m:oMath>
+        <m:d>
+          <m:dPr>
+            <m:ctrlPr>
+              <w:rPr>
+                <w:rFonts w:ascii="Cambria Math" w:eastAsiaTheme="minorEastAsia" w:hAnsi="Cambria Math" w:cs="Times New Roman"/>
+                <w:i/>
+              </w:rPr>
+            </m:ctrlPr>
+          </m:dPr>
+          <m:e>
+            <m:sSup>
+              <m:sSupPr>
+                <m:ctrlPr>
+                  <w:rPr>
+                    <w:rFonts w:ascii="Cambria Math" w:hAnsi="Cambria Math" w:cs="Times New Roman"/>
+                    <w:i/>
+                  </w:rPr>
+                </m:ctrlPr>
+              </m:sSupPr>
+              <m:e>
+                <m:d>
+                  <m:dPr>
+                    <m:ctrlPr>
+                      <w:rPr>
+                        <w:rFonts w:ascii="Cambria Math" w:hAnsi="Cambria Math" w:cs="Times New Roman"/>
+                        <w:i/>
+                      </w:rPr>
+                    </m:ctrlPr>
+                  </m:dPr>
+                  <m:e>
+                    <m:r>
+                      <w:rPr>
+                        <w:rFonts w:ascii="Cambria Math" w:hAnsi="Cambria Math" w:cs="Times New Roman"/>
+                        <w:lang w:val="id-ID"/>
+                      </w:rPr>
+                      <m:t>E + x</m:t>
+                    </m:r>
+                  </m:e>
+                </m:d>
+              </m:e>
+              <m:sup>
+                <m:r>
+                  <w:rPr>
+                    <w:rFonts w:ascii="Cambria Math" w:hAnsi="Cambria Math" w:cs="Times New Roman"/>
+                    <w:lang w:val="id-ID"/>
+                  </w:rPr>
+                  <m:t>n</m:t>
+                </m:r>
+              </m:sup>
+            </m:sSup>
+            <m:r>
+              <w:rPr>
+                <w:rFonts w:ascii="Cambria Math" w:hAnsi="Cambria Math" w:cs="Times New Roman"/>
+                <w:lang w:val="id-ID"/>
+              </w:rPr>
+              <m:t xml:space="preserve"> - </m:t>
+            </m:r>
+            <m:sSup>
+              <m:sSupPr>
+                <m:ctrlPr>
+                  <w:rPr>
+                    <w:rFonts w:ascii="Cambria Math" w:eastAsiaTheme="minorEastAsia" w:hAnsi="Cambria Math" w:cs="Times New Roman"/>
+                    <w:i/>
+                  </w:rPr>
+                </m:ctrlPr>
+              </m:sSupPr>
+              <m:e>
+                <m:r>
+                  <w:rPr>
+                    <w:rFonts w:ascii="Cambria Math" w:eastAsiaTheme="minorEastAsia" w:hAnsi="Cambria Math" w:cs="Times New Roman"/>
+                    <w:lang w:val="id-ID"/>
+                  </w:rPr>
+                  <m:t>E</m:t>
+                </m:r>
+              </m:e>
+              <m:sup>
+                <m:r>
+                  <w:rPr>
+                    <w:rFonts w:ascii="Cambria Math" w:eastAsiaTheme="minorEastAsia" w:hAnsi="Cambria Math" w:cs="Times New Roman"/>
+                    <w:lang w:val="id-ID"/>
+                  </w:rPr>
+                  <m:t>n</m:t>
+                </m:r>
+              </m:sup>
+            </m:sSup>
+          </m:e>
+        </m:d>
+        <m:r>
+          <w:rPr>
+            <w:rFonts w:ascii="Cambria Math" w:hAnsi="Cambria Math" w:cs="Times New Roman"/>
+            <w:lang w:val="id-ID"/>
+          </w:rPr>
+          <m:t xml:space="preserve"> = </m:t>
+        </m:r>
+        <m:d>
+          <m:dPr>
+            <m:ctrlPr>
+              <w:rPr>
+                <w:rFonts w:ascii="Cambria Math" w:hAnsi="Cambria Math" w:cs="Times New Roman"/>
+                <w:i/>
+              </w:rPr>
+            </m:ctrlPr>
+          </m:dPr>
+          <m:e>
+            <m:sSup>
+              <m:sSupPr>
+                <m:ctrlPr>
+                  <w:rPr>
+                    <w:rFonts w:ascii="Cambria Math" w:hAnsi="Cambria Math" w:cs="Times New Roman"/>
+                    <w:i/>
+                  </w:rPr>
+                </m:ctrlPr>
+              </m:sSupPr>
+              <m:e>
+                <m:r>
+                  <w:rPr>
+                    <w:rFonts w:ascii="Cambria Math" w:hAnsi="Cambria Math" w:cs="Times New Roman"/>
+                    <w:lang w:val="id-ID"/>
+                  </w:rPr>
+                  <m:t>x</m:t>
+                </m:r>
+              </m:e>
+              <m:sup>
+                <m:r>
+                  <w:rPr>
+                    <w:rFonts w:ascii="Cambria Math" w:hAnsi="Cambria Math" w:cs="Times New Roman"/>
+                    <w:lang w:val="id-ID"/>
+                  </w:rPr>
+                  <m:t>n</m:t>
+                </m:r>
+              </m:sup>
+            </m:sSup>
+            <m:r>
+              <w:rPr>
+                <w:rFonts w:ascii="Cambria Math" w:hAnsi="Cambria Math" w:cs="Times New Roman"/>
+                <w:lang w:val="id-ID"/>
+              </w:rPr>
+              <m:t xml:space="preserve"> + </m:t>
+            </m:r>
+            <m:d>
+              <m:dPr>
+                <m:begChr m:val="{"/>
+                <m:endChr m:val="}"/>
+                <m:ctrlPr>
+                  <w:rPr>
+                    <w:rFonts w:ascii="Cambria Math" w:hAnsi="Cambria Math" w:cs="Times New Roman"/>
+                    <w:i/>
+                  </w:rPr>
+                </m:ctrlPr>
+              </m:dPr>
+              <m:e>
+                <m:r>
+                  <w:rPr>
+                    <w:rFonts w:ascii="Cambria Math" w:hAnsi="Cambria Math" w:cs="Times New Roman"/>
+                    <w:lang w:val="id-ID"/>
+                  </w:rPr>
+                  <m:t>x × E × n</m:t>
+                </m:r>
+              </m:e>
+            </m:d>
+            <m:r>
+              <w:rPr>
+                <w:rFonts w:ascii="Cambria Math" w:hAnsi="Cambria Math" w:cs="Times New Roman"/>
+                <w:lang w:val="id-ID"/>
+              </w:rPr>
+              <m:t xml:space="preserve"> - </m:t>
+            </m:r>
+            <m:sSup>
+              <m:sSupPr>
+                <m:ctrlPr>
+                  <w:rPr>
+                    <w:rFonts w:ascii="Cambria Math" w:hAnsi="Cambria Math" w:cs="Times New Roman"/>
+                    <w:i/>
+                  </w:rPr>
+                </m:ctrlPr>
+              </m:sSupPr>
+              <m:e>
+                <m:d>
+                  <m:dPr>
+                    <m:begChr m:val="{"/>
+                    <m:endChr m:val="}"/>
+                    <m:ctrlPr>
+                      <w:rPr>
+                        <w:rFonts w:ascii="Cambria Math" w:hAnsi="Cambria Math" w:cs="Times New Roman"/>
+                        <w:i/>
+                      </w:rPr>
+                    </m:ctrlPr>
+                  </m:dPr>
+                  <m:e>
+                    <m:r>
+                      <w:rPr>
+                        <w:rFonts w:ascii="Cambria Math" w:hAnsi="Cambria Math" w:cs="Times New Roman"/>
+                        <w:lang w:val="id-ID"/>
+                      </w:rPr>
+                      <m:t>E × x</m:t>
+                    </m:r>
+                  </m:e>
+                </m:d>
+              </m:e>
+              <m:sup>
+                <m:d>
+                  <m:dPr>
+                    <m:ctrlPr>
+                      <w:rPr>
+                        <w:rFonts w:ascii="Cambria Math" w:hAnsi="Cambria Math" w:cs="Times New Roman"/>
+                        <w:i/>
+                      </w:rPr>
+                    </m:ctrlPr>
+                  </m:dPr>
+                  <m:e>
+                    <m:r>
+                      <w:rPr>
+                        <w:rFonts w:ascii="Cambria Math" w:hAnsi="Cambria Math" w:cs="Times New Roman"/>
+                        <w:lang w:val="id-ID"/>
+                      </w:rPr>
+                      <m:t>n - 1</m:t>
+                    </m:r>
+                  </m:e>
+                </m:d>
+              </m:sup>
+            </m:sSup>
+            <m:r>
+              <w:rPr>
+                <w:rFonts w:ascii="Cambria Math" w:hAnsi="Cambria Math" w:cs="Times New Roman"/>
+                <w:lang w:val="id-ID"/>
+              </w:rPr>
+              <m:t xml:space="preserve"> + </m:t>
+            </m:r>
+            <m:sSup>
+              <m:sSupPr>
+                <m:ctrlPr>
+                  <w:rPr>
+                    <w:rFonts w:ascii="Cambria Math" w:hAnsi="Cambria Math" w:cs="Times New Roman"/>
+                    <w:i/>
+                  </w:rPr>
+                </m:ctrlPr>
+              </m:sSupPr>
+              <m:e>
+                <m:r>
+                  <w:rPr>
+                    <w:rFonts w:ascii="Cambria Math" w:hAnsi="Cambria Math" w:cs="Times New Roman"/>
+                    <w:lang w:val="id-ID"/>
+                  </w:rPr>
+                  <m:t>E</m:t>
+                </m:r>
+              </m:e>
+              <m:sup>
+                <m:d>
+                  <m:dPr>
+                    <m:ctrlPr>
+                      <w:rPr>
+                        <w:rFonts w:ascii="Cambria Math" w:hAnsi="Cambria Math" w:cs="Times New Roman"/>
+                        <w:i/>
+                      </w:rPr>
+                    </m:ctrlPr>
+                  </m:dPr>
+                  <m:e>
+                    <m:d>
+                      <m:dPr>
+                        <m:ctrlPr>
+                          <w:rPr>
+                            <w:rFonts w:ascii="Cambria Math" w:hAnsi="Cambria Math" w:cs="Times New Roman"/>
+                            <w:i/>
+                          </w:rPr>
+                        </m:ctrlPr>
+                      </m:dPr>
+                      <m:e>
+                        <m:r>
+                          <w:rPr>
+                            <w:rFonts w:ascii="Cambria Math" w:hAnsi="Cambria Math" w:cs="Times New Roman"/>
+                            <w:lang w:val="id-ID"/>
+                          </w:rPr>
+                          <m:t>2 × n</m:t>
+                        </m:r>
+                      </m:e>
+                    </m:d>
+                    <m:r>
+                      <w:rPr>
+                        <w:rFonts w:ascii="Cambria Math" w:hAnsi="Cambria Math" w:cs="Times New Roman"/>
+                        <w:lang w:val="id-ID"/>
+                      </w:rPr>
+                      <m:t xml:space="preserve"> - 1</m:t>
+                    </m:r>
+                  </m:e>
+                </m:d>
+              </m:sup>
+            </m:sSup>
+          </m:e>
+        </m:d>
+      </m:oMath>
+      <w:r>
+        <w:rPr>
+          <w:rFonts w:ascii="Times New Roman" w:hAnsi="Times New Roman" w:cs="Times New Roman"/>
+          <w:lang w:val="id-ID"/>
+        </w:rPr>
+        <w:t xml:space="preserve"> </w:t>
+      </w:r>
     </w:p>
     <w:sectPr>
       <w:pgSz w:w="11906" w:h="16838" w:code="9"/>

</xml_diff>